<commit_message>
Lab 7 practice done, report left
</commit_message>
<xml_diff>
--- a/network/lab-7/ПРИ123-ИС-#07-Нямаа.docx
+++ b/network/lab-7/ПРИ123-ИС-#07-Нямаа.docx
@@ -1,9 +1,10 @@
 
 <file path=word/document.xml><?xml version="1.0" encoding="utf-8"?>
-<w:document xmlns:wpc="http://schemas.microsoft.com/office/word/2010/wordprocessingCanvas" xmlns:cx="http://schemas.microsoft.com/office/drawing/2014/chartex" xmlns:cx1="http://schemas.microsoft.com/office/drawing/2015/9/8/chartex" xmlns:cx2="http://schemas.microsoft.com/office/drawing/2015/10/21/chartex" xmlns:cx3="http://schemas.microsoft.com/office/drawing/2016/5/9/chartex" xmlns:cx4="http://schemas.microsoft.com/office/drawing/2016/5/10/chartex" xmlns:cx5="http://schemas.microsoft.com/office/drawing/2016/5/11/chartex" xmlns:cx6="http://schemas.microsoft.com/office/drawing/2016/5/12/chartex" xmlns:cx7="http://schemas.microsoft.com/office/drawing/2016/5/13/chartex" xmlns:cx8="http://schemas.microsoft.com/office/drawing/2016/5/14/chartex" xmlns:mc="http://schemas.openxmlformats.org/markup-compatibility/2006" xmlns:aink="http://schemas.microsoft.com/office/drawing/2016/ink" xmlns:am3d="http://schemas.microsoft.com/office/drawing/2017/model3d" xmlns:o="urn:schemas-microsoft-com:office:office" xmlns:oel="http://schemas.microsoft.com/office/2019/extlst" xmlns:r="http://schemas.openxmlformats.org/officeDocument/2006/relationships" xmlns:m="http://schemas.openxmlformats.org/officeDocument/2006/math" xmlns:v="urn:schemas-microsoft-com:vml" xmlns:wp14="http://schemas.microsoft.com/office/word/2010/wordprocessingDrawing" xmlns:wp="http://schemas.openxmlformats.org/drawingml/2006/wordprocessingDrawing" xmlns:w10="urn:schemas-microsoft-com:office:word" xmlns:w="http://schemas.openxmlformats.org/wordprocessingml/2006/main" xmlns:w14="http://schemas.microsoft.com/office/word/2010/wordml" xmlns:w15="http://schemas.microsoft.com/office/word/2012/wordml" xmlns:w16cex="http://schemas.microsoft.com/office/word/2018/wordml/cex" xmlns:w16cid="http://schemas.microsoft.com/office/word/2016/wordml/cid" xmlns:w16="http://schemas.microsoft.com/office/word/2018/wordml" xmlns:w16sdtdh="http://schemas.microsoft.com/office/word/2020/wordml/sdtdatahash" xmlns:w16se="http://schemas.microsoft.com/office/word/2015/wordml/symex" xmlns:wpg="http://schemas.microsoft.com/office/word/2010/wordprocessingGroup" xmlns:wpi="http://schemas.microsoft.com/office/word/2010/wordprocessingInk" xmlns:wne="http://schemas.microsoft.com/office/word/2006/wordml" xmlns:wps="http://schemas.microsoft.com/office/word/2010/wordprocessingShape" mc:Ignorable="w14 w15 w16se w16cid w16 w16cex w16sdtdh wp14">
+<w:document xmlns:o="urn:schemas-microsoft-com:office:office" xmlns:r="http://schemas.openxmlformats.org/officeDocument/2006/relationships" xmlns:v="urn:schemas-microsoft-com:vml" xmlns:w="http://schemas.openxmlformats.org/wordprocessingml/2006/main" xmlns:w10="urn:schemas-microsoft-com:office:word" xmlns:wp="http://schemas.openxmlformats.org/drawingml/2006/wordprocessingDrawing" xmlns:wps="http://schemas.microsoft.com/office/word/2010/wordprocessingShape" xmlns:wpg="http://schemas.microsoft.com/office/word/2010/wordprocessingGroup" xmlns:mc="http://schemas.openxmlformats.org/markup-compatibility/2006" xmlns:wp14="http://schemas.microsoft.com/office/word/2010/wordprocessingDrawing" xmlns:w14="http://schemas.microsoft.com/office/word/2010/wordml" xmlns:w15="http://schemas.microsoft.com/office/word/2012/wordml" mc:Ignorable="w14 wp14 w15">
   <w:body>
     <w:p>
       <w:pPr>
+        <w:pStyle w:val="Normal"/>
         <w:ind w:right="-1"/>
         <w:jc w:val="center"/>
         <w:rPr>
@@ -12,6 +13,20 @@
         </w:rPr>
       </w:pPr>
       <w:r>
+        <w:rPr/>
+      </w:r>
+    </w:p>
+    <w:p>
+      <w:pPr>
+        <w:pStyle w:val="Normal"/>
+        <w:ind w:right="-1"/>
+        <w:jc w:val="center"/>
+        <w:rPr>
+          <w:sz w:val="24"/>
+          <w:szCs w:val="24"/>
+        </w:rPr>
+      </w:pPr>
+      <w:r>
         <w:rPr>
           <w:sz w:val="24"/>
           <w:szCs w:val="24"/>
@@ -67,6 +82,7 @@
     </w:p>
     <w:p>
       <w:pPr>
+        <w:pStyle w:val="Normal"/>
         <w:ind w:right="-1"/>
         <w:jc w:val="center"/>
         <w:rPr>
@@ -188,6 +204,7 @@
     </w:p>
     <w:p>
       <w:pPr>
+        <w:pStyle w:val="Normal"/>
         <w:ind w:right="-1"/>
         <w:jc w:val="center"/>
         <w:rPr>
@@ -235,6 +252,7 @@
     </w:p>
     <w:p>
       <w:pPr>
+        <w:pStyle w:val="Normal"/>
         <w:ind w:right="-1"/>
         <w:jc w:val="center"/>
         <w:rPr>
@@ -343,6 +361,7 @@
     </w:p>
     <w:p>
       <w:pPr>
+        <w:pStyle w:val="Normal"/>
         <w:ind w:right="-1"/>
         <w:jc w:val="center"/>
         <w:rPr>
@@ -356,40 +375,31 @@
           <w:sz w:val="24"/>
           <w:szCs w:val="24"/>
         </w:rPr>
-        <w:t>(</w:t>
-      </w:r>
-      <w:proofErr w:type="spellStart"/>
-      <w:r>
+        <w:t>(ВлГУ)</w:t>
+      </w:r>
+    </w:p>
+    <w:p>
+      <w:pPr>
+        <w:pStyle w:val="Normal"/>
+        <w:ind w:right="-1"/>
+        <w:jc w:val="center"/>
         <w:rPr>
           <w:b/>
           <w:sz w:val="24"/>
           <w:szCs w:val="24"/>
         </w:rPr>
-        <w:t>ВлГУ</w:t>
-      </w:r>
-      <w:proofErr w:type="spellEnd"/>
+      </w:pPr>
       <w:r>
         <w:rPr>
           <w:b/>
           <w:sz w:val="24"/>
           <w:szCs w:val="24"/>
         </w:rPr>
-        <w:t>)</w:t>
-      </w:r>
-    </w:p>
-    <w:p>
-      <w:pPr>
-        <w:ind w:right="-1"/>
-        <w:jc w:val="center"/>
-        <w:rPr>
-          <w:b/>
-          <w:sz w:val="24"/>
-          <w:szCs w:val="24"/>
-        </w:rPr>
-      </w:pPr>
-    </w:p>
-    <w:p>
-      <w:pPr>
+      </w:r>
+    </w:p>
+    <w:p>
+      <w:pPr>
+        <w:pStyle w:val="Normal"/>
         <w:ind w:right="-1"/>
         <w:jc w:val="center"/>
         <w:rPr>
@@ -494,116 +504,194 @@
     </w:p>
     <w:p>
       <w:pPr>
-        <w:pStyle w:val="a4"/>
+        <w:pStyle w:val="PlainText"/>
         <w:rPr>
           <w:rFonts w:ascii="Times New Roman" w:hAnsi="Times New Roman"/>
           <w:sz w:val="28"/>
           <w:szCs w:val="28"/>
         </w:rPr>
       </w:pPr>
-    </w:p>
-    <w:p>
-      <w:pPr>
-        <w:pStyle w:val="a4"/>
+      <w:r>
         <w:rPr>
           <w:rFonts w:ascii="Times New Roman" w:hAnsi="Times New Roman"/>
           <w:sz w:val="28"/>
           <w:szCs w:val="28"/>
         </w:rPr>
-      </w:pPr>
-    </w:p>
-    <w:p>
-      <w:pPr>
-        <w:pStyle w:val="a4"/>
+      </w:r>
+    </w:p>
+    <w:p>
+      <w:pPr>
+        <w:pStyle w:val="PlainText"/>
         <w:rPr>
           <w:rFonts w:ascii="Times New Roman" w:hAnsi="Times New Roman"/>
           <w:sz w:val="28"/>
           <w:szCs w:val="28"/>
         </w:rPr>
       </w:pPr>
-    </w:p>
-    <w:p>
-      <w:pPr>
-        <w:pStyle w:val="a4"/>
+      <w:r>
         <w:rPr>
           <w:rFonts w:ascii="Times New Roman" w:hAnsi="Times New Roman"/>
           <w:sz w:val="28"/>
           <w:szCs w:val="28"/>
         </w:rPr>
-      </w:pPr>
-    </w:p>
-    <w:p>
-      <w:pPr>
-        <w:pStyle w:val="a4"/>
+      </w:r>
+    </w:p>
+    <w:p>
+      <w:pPr>
+        <w:pStyle w:val="PlainText"/>
         <w:rPr>
           <w:rFonts w:ascii="Times New Roman" w:hAnsi="Times New Roman"/>
           <w:sz w:val="28"/>
           <w:szCs w:val="28"/>
         </w:rPr>
       </w:pPr>
-    </w:p>
-    <w:p>
-      <w:pPr>
-        <w:pStyle w:val="a4"/>
+      <w:r>
         <w:rPr>
           <w:rFonts w:ascii="Times New Roman" w:hAnsi="Times New Roman"/>
           <w:sz w:val="28"/>
           <w:szCs w:val="28"/>
         </w:rPr>
-      </w:pPr>
-    </w:p>
-    <w:p>
-      <w:pPr>
-        <w:pStyle w:val="a4"/>
+      </w:r>
+    </w:p>
+    <w:p>
+      <w:pPr>
+        <w:pStyle w:val="PlainText"/>
         <w:rPr>
           <w:rFonts w:ascii="Times New Roman" w:hAnsi="Times New Roman"/>
           <w:sz w:val="28"/>
           <w:szCs w:val="28"/>
         </w:rPr>
       </w:pPr>
-    </w:p>
-    <w:p>
-      <w:pPr>
-        <w:pStyle w:val="a4"/>
+      <w:r>
         <w:rPr>
           <w:rFonts w:ascii="Times New Roman" w:hAnsi="Times New Roman"/>
           <w:sz w:val="28"/>
           <w:szCs w:val="28"/>
         </w:rPr>
-      </w:pPr>
-    </w:p>
-    <w:p>
-      <w:pPr>
-        <w:pStyle w:val="a4"/>
+      </w:r>
+    </w:p>
+    <w:p>
+      <w:pPr>
+        <w:pStyle w:val="PlainText"/>
         <w:rPr>
           <w:rFonts w:ascii="Times New Roman" w:hAnsi="Times New Roman"/>
           <w:sz w:val="28"/>
           <w:szCs w:val="28"/>
         </w:rPr>
       </w:pPr>
-    </w:p>
-    <w:p>
-      <w:pPr>
-        <w:pStyle w:val="a4"/>
+      <w:r>
         <w:rPr>
           <w:rFonts w:ascii="Times New Roman" w:hAnsi="Times New Roman"/>
           <w:sz w:val="28"/>
           <w:szCs w:val="28"/>
         </w:rPr>
-      </w:pPr>
-    </w:p>
-    <w:p>
-      <w:pPr>
-        <w:pStyle w:val="a4"/>
+      </w:r>
+    </w:p>
+    <w:p>
+      <w:pPr>
+        <w:pStyle w:val="PlainText"/>
         <w:rPr>
           <w:rFonts w:ascii="Times New Roman" w:hAnsi="Times New Roman"/>
           <w:sz w:val="28"/>
           <w:szCs w:val="28"/>
         </w:rPr>
       </w:pPr>
-    </w:p>
-    <w:p>
-      <w:pPr>
+      <w:r>
+        <w:rPr>
+          <w:rFonts w:ascii="Times New Roman" w:hAnsi="Times New Roman"/>
+          <w:sz w:val="28"/>
+          <w:szCs w:val="28"/>
+        </w:rPr>
+      </w:r>
+    </w:p>
+    <w:p>
+      <w:pPr>
+        <w:pStyle w:val="PlainText"/>
+        <w:rPr>
+          <w:rFonts w:ascii="Times New Roman" w:hAnsi="Times New Roman"/>
+          <w:sz w:val="28"/>
+          <w:szCs w:val="28"/>
+        </w:rPr>
+      </w:pPr>
+      <w:r>
+        <w:rPr>
+          <w:rFonts w:ascii="Times New Roman" w:hAnsi="Times New Roman"/>
+          <w:sz w:val="28"/>
+          <w:szCs w:val="28"/>
+        </w:rPr>
+      </w:r>
+    </w:p>
+    <w:p>
+      <w:pPr>
+        <w:pStyle w:val="PlainText"/>
+        <w:rPr>
+          <w:rFonts w:ascii="Times New Roman" w:hAnsi="Times New Roman"/>
+          <w:sz w:val="28"/>
+          <w:szCs w:val="28"/>
+        </w:rPr>
+      </w:pPr>
+      <w:r>
+        <w:rPr>
+          <w:rFonts w:ascii="Times New Roman" w:hAnsi="Times New Roman"/>
+          <w:sz w:val="28"/>
+          <w:szCs w:val="28"/>
+        </w:rPr>
+      </w:r>
+    </w:p>
+    <w:p>
+      <w:pPr>
+        <w:pStyle w:val="PlainText"/>
+        <w:rPr>
+          <w:rFonts w:ascii="Times New Roman" w:hAnsi="Times New Roman"/>
+          <w:sz w:val="28"/>
+          <w:szCs w:val="28"/>
+        </w:rPr>
+      </w:pPr>
+      <w:r>
+        <w:rPr>
+          <w:rFonts w:ascii="Times New Roman" w:hAnsi="Times New Roman"/>
+          <w:sz w:val="28"/>
+          <w:szCs w:val="28"/>
+        </w:rPr>
+      </w:r>
+    </w:p>
+    <w:p>
+      <w:pPr>
+        <w:pStyle w:val="PlainText"/>
+        <w:rPr>
+          <w:rFonts w:ascii="Times New Roman" w:hAnsi="Times New Roman"/>
+          <w:sz w:val="28"/>
+          <w:szCs w:val="28"/>
+        </w:rPr>
+      </w:pPr>
+      <w:r>
+        <w:rPr>
+          <w:rFonts w:ascii="Times New Roman" w:hAnsi="Times New Roman"/>
+          <w:sz w:val="28"/>
+          <w:szCs w:val="28"/>
+        </w:rPr>
+      </w:r>
+    </w:p>
+    <w:p>
+      <w:pPr>
+        <w:pStyle w:val="PlainText"/>
+        <w:rPr>
+          <w:rFonts w:ascii="Times New Roman" w:hAnsi="Times New Roman"/>
+          <w:sz w:val="28"/>
+          <w:szCs w:val="28"/>
+        </w:rPr>
+      </w:pPr>
+      <w:r>
+        <w:rPr>
+          <w:rFonts w:ascii="Times New Roman" w:hAnsi="Times New Roman"/>
+          <w:sz w:val="28"/>
+          <w:szCs w:val="28"/>
+        </w:rPr>
+      </w:r>
+    </w:p>
+    <w:p>
+      <w:pPr>
+        <w:pStyle w:val="Normal"/>
         <w:jc w:val="center"/>
         <w:rPr>
           <w:sz w:val="44"/>
@@ -629,6 +717,7 @@
     </w:p>
     <w:p>
       <w:pPr>
+        <w:pStyle w:val="Normal"/>
         <w:jc w:val="center"/>
         <w:rPr>
           <w:sz w:val="44"/>
@@ -645,22 +734,37 @@
     </w:p>
     <w:p>
       <w:pPr>
+        <w:pStyle w:val="Normal"/>
         <w:rPr>
           <w:sz w:val="44"/>
           <w:szCs w:val="28"/>
         </w:rPr>
       </w:pPr>
-    </w:p>
-    <w:p>
-      <w:pPr>
-        <w:rPr>
-          <w:sz w:val="28"/>
-          <w:szCs w:val="28"/>
-        </w:rPr>
-      </w:pPr>
-    </w:p>
-    <w:p>
-      <w:pPr>
+      <w:r>
+        <w:rPr>
+          <w:sz w:val="44"/>
+          <w:szCs w:val="28"/>
+        </w:rPr>
+      </w:r>
+    </w:p>
+    <w:p>
+      <w:pPr>
+        <w:pStyle w:val="Normal"/>
+        <w:rPr>
+          <w:sz w:val="28"/>
+          <w:szCs w:val="28"/>
+        </w:rPr>
+      </w:pPr>
+      <w:r>
+        <w:rPr>
+          <w:sz w:val="28"/>
+          <w:szCs w:val="28"/>
+        </w:rPr>
+      </w:r>
+    </w:p>
+    <w:p>
+      <w:pPr>
+        <w:pStyle w:val="Normal"/>
         <w:jc w:val="center"/>
         <w:rPr>
           <w:sz w:val="36"/>
@@ -699,47 +803,83 @@
     </w:p>
     <w:p>
       <w:pPr>
-        <w:rPr>
-          <w:sz w:val="28"/>
-          <w:szCs w:val="28"/>
-        </w:rPr>
-      </w:pPr>
-    </w:p>
-    <w:p>
-      <w:pPr>
-        <w:rPr>
-          <w:sz w:val="28"/>
-          <w:szCs w:val="28"/>
-        </w:rPr>
-      </w:pPr>
-    </w:p>
-    <w:p>
-      <w:pPr>
-        <w:rPr>
-          <w:sz w:val="28"/>
-          <w:szCs w:val="28"/>
-        </w:rPr>
-      </w:pPr>
-    </w:p>
-    <w:p>
-      <w:pPr>
-        <w:rPr>
-          <w:sz w:val="28"/>
-          <w:szCs w:val="28"/>
-        </w:rPr>
-      </w:pPr>
-    </w:p>
-    <w:p>
-      <w:pPr>
-        <w:rPr>
-          <w:sz w:val="28"/>
-          <w:szCs w:val="28"/>
-        </w:rPr>
-      </w:pPr>
-    </w:p>
-    <w:p>
-      <w:pPr>
-        <w:ind w:left="6663" w:hanging="284"/>
+        <w:pStyle w:val="Normal"/>
+        <w:rPr>
+          <w:sz w:val="28"/>
+          <w:szCs w:val="28"/>
+        </w:rPr>
+      </w:pPr>
+      <w:r>
+        <w:rPr>
+          <w:sz w:val="28"/>
+          <w:szCs w:val="28"/>
+        </w:rPr>
+      </w:r>
+    </w:p>
+    <w:p>
+      <w:pPr>
+        <w:pStyle w:val="Normal"/>
+        <w:rPr>
+          <w:sz w:val="28"/>
+          <w:szCs w:val="28"/>
+        </w:rPr>
+      </w:pPr>
+      <w:r>
+        <w:rPr>
+          <w:sz w:val="28"/>
+          <w:szCs w:val="28"/>
+        </w:rPr>
+      </w:r>
+    </w:p>
+    <w:p>
+      <w:pPr>
+        <w:pStyle w:val="Normal"/>
+        <w:rPr>
+          <w:sz w:val="28"/>
+          <w:szCs w:val="28"/>
+        </w:rPr>
+      </w:pPr>
+      <w:r>
+        <w:rPr>
+          <w:sz w:val="28"/>
+          <w:szCs w:val="28"/>
+        </w:rPr>
+      </w:r>
+    </w:p>
+    <w:p>
+      <w:pPr>
+        <w:pStyle w:val="Normal"/>
+        <w:rPr>
+          <w:sz w:val="28"/>
+          <w:szCs w:val="28"/>
+        </w:rPr>
+      </w:pPr>
+      <w:r>
+        <w:rPr>
+          <w:sz w:val="28"/>
+          <w:szCs w:val="28"/>
+        </w:rPr>
+      </w:r>
+    </w:p>
+    <w:p>
+      <w:pPr>
+        <w:pStyle w:val="Normal"/>
+        <w:rPr>
+          <w:sz w:val="28"/>
+          <w:szCs w:val="28"/>
+        </w:rPr>
+      </w:pPr>
+      <w:r>
+        <w:rPr>
+          <w:sz w:val="28"/>
+          <w:szCs w:val="28"/>
+        </w:rPr>
+      </w:r>
+    </w:p>
+    <w:p>
+      <w:pPr>
+        <w:pStyle w:val="Normal"/>
+        <w:ind w:hanging="284" w:left="6663"/>
         <w:rPr>
           <w:sz w:val="28"/>
           <w:szCs w:val="28"/>
@@ -755,7 +895,8 @@
     </w:p>
     <w:p>
       <w:pPr>
-        <w:ind w:left="6663" w:hanging="284"/>
+        <w:pStyle w:val="Normal"/>
+        <w:ind w:hanging="284" w:left="6663"/>
         <w:rPr>
           <w:sz w:val="28"/>
           <w:szCs w:val="28"/>
@@ -771,44 +912,43 @@
     </w:p>
     <w:p>
       <w:pPr>
-        <w:ind w:left="6663" w:hanging="284"/>
-        <w:rPr>
-          <w:color w:val="000000" w:themeColor="text1"/>
-          <w:sz w:val="28"/>
-          <w:szCs w:val="28"/>
-        </w:rPr>
-      </w:pPr>
-      <w:r>
-        <w:rPr>
-          <w:color w:val="000000" w:themeColor="text1"/>
-          <w:sz w:val="28"/>
-          <w:szCs w:val="28"/>
-        </w:rPr>
-        <w:t xml:space="preserve">А.Ц. </w:t>
-      </w:r>
-      <w:proofErr w:type="spellStart"/>
-      <w:r>
-        <w:rPr>
-          <w:color w:val="000000" w:themeColor="text1"/>
-          <w:sz w:val="28"/>
-          <w:szCs w:val="28"/>
-        </w:rPr>
-        <w:t>Нямаа</w:t>
-      </w:r>
-      <w:proofErr w:type="spellEnd"/>
-    </w:p>
-    <w:p>
-      <w:pPr>
+        <w:pStyle w:val="Normal"/>
+        <w:ind w:hanging="284" w:left="6663"/>
+        <w:rPr>
+          <w:color w:themeColor="text1" w:val="000000"/>
+          <w:sz w:val="28"/>
+          <w:szCs w:val="28"/>
+        </w:rPr>
+      </w:pPr>
+      <w:r>
+        <w:rPr>
+          <w:color w:themeColor="text1" w:val="000000"/>
+          <w:sz w:val="28"/>
+          <w:szCs w:val="28"/>
+        </w:rPr>
+        <w:t>А.Ц. Нямаа</w:t>
+      </w:r>
+    </w:p>
+    <w:p>
+      <w:pPr>
+        <w:pStyle w:val="Normal"/>
         <w:jc w:val="right"/>
         <w:rPr>
           <w:sz w:val="28"/>
           <w:szCs w:val="28"/>
         </w:rPr>
       </w:pPr>
-    </w:p>
-    <w:p>
-      <w:pPr>
-        <w:ind w:left="6663" w:hanging="284"/>
+      <w:r>
+        <w:rPr>
+          <w:sz w:val="28"/>
+          <w:szCs w:val="28"/>
+        </w:rPr>
+      </w:r>
+    </w:p>
+    <w:p>
+      <w:pPr>
+        <w:pStyle w:val="Normal"/>
+        <w:ind w:hanging="284" w:left="6663"/>
         <w:rPr>
           <w:sz w:val="28"/>
           <w:szCs w:val="28"/>
@@ -824,7 +964,8 @@
     </w:p>
     <w:p>
       <w:pPr>
-        <w:ind w:left="6663" w:hanging="284"/>
+        <w:pStyle w:val="Normal"/>
+        <w:ind w:hanging="284" w:left="6663"/>
         <w:rPr>
           <w:sz w:val="28"/>
           <w:szCs w:val="28"/>
@@ -840,16 +981,17 @@
     </w:p>
     <w:p>
       <w:pPr>
-        <w:ind w:left="6663" w:hanging="284"/>
-        <w:rPr>
-          <w:color w:val="000000" w:themeColor="text1"/>
-          <w:sz w:val="28"/>
-          <w:szCs w:val="28"/>
-        </w:rPr>
-      </w:pPr>
-      <w:r>
-        <w:rPr>
-          <w:color w:val="000000" w:themeColor="text1"/>
+        <w:pStyle w:val="Normal"/>
+        <w:ind w:hanging="284" w:left="6663"/>
+        <w:rPr>
+          <w:color w:themeColor="text1" w:val="000000"/>
+          <w:sz w:val="28"/>
+          <w:szCs w:val="28"/>
+        </w:rPr>
+      </w:pPr>
+      <w:r>
+        <w:rPr>
+          <w:color w:themeColor="text1" w:val="000000"/>
           <w:sz w:val="28"/>
           <w:szCs w:val="28"/>
         </w:rPr>
@@ -858,71 +1000,89 @@
     </w:p>
     <w:p>
       <w:pPr>
-        <w:pStyle w:val="a4"/>
+        <w:pStyle w:val="PlainText"/>
         <w:rPr>
           <w:rFonts w:ascii="Times New Roman" w:hAnsi="Times New Roman"/>
           <w:sz w:val="28"/>
           <w:szCs w:val="28"/>
         </w:rPr>
       </w:pPr>
-    </w:p>
-    <w:p>
-      <w:pPr>
-        <w:pStyle w:val="a4"/>
+      <w:r>
         <w:rPr>
           <w:rFonts w:ascii="Times New Roman" w:hAnsi="Times New Roman"/>
           <w:sz w:val="28"/>
           <w:szCs w:val="28"/>
         </w:rPr>
-      </w:pPr>
-    </w:p>
-    <w:p>
-      <w:pPr>
-        <w:pStyle w:val="a4"/>
+      </w:r>
+    </w:p>
+    <w:p>
+      <w:pPr>
+        <w:pStyle w:val="PlainText"/>
         <w:rPr>
           <w:rFonts w:ascii="Times New Roman" w:hAnsi="Times New Roman"/>
           <w:sz w:val="28"/>
           <w:szCs w:val="28"/>
         </w:rPr>
       </w:pPr>
-    </w:p>
-    <w:p>
-      <w:pPr>
-        <w:pStyle w:val="a4"/>
+      <w:r>
         <w:rPr>
           <w:rFonts w:ascii="Times New Roman" w:hAnsi="Times New Roman"/>
           <w:sz w:val="28"/>
           <w:szCs w:val="28"/>
         </w:rPr>
-      </w:pPr>
-    </w:p>
-    <w:p>
-      <w:pPr>
-        <w:pStyle w:val="a4"/>
-        <w:jc w:val="center"/>
+      </w:r>
+    </w:p>
+    <w:p>
+      <w:pPr>
+        <w:pStyle w:val="PlainText"/>
         <w:rPr>
           <w:rFonts w:ascii="Times New Roman" w:hAnsi="Times New Roman"/>
           <w:sz w:val="28"/>
           <w:szCs w:val="28"/>
         </w:rPr>
       </w:pPr>
-    </w:p>
-    <w:p>
-      <w:pPr>
-        <w:pStyle w:val="a4"/>
-        <w:jc w:val="center"/>
+      <w:r>
         <w:rPr>
           <w:rFonts w:ascii="Times New Roman" w:hAnsi="Times New Roman"/>
           <w:sz w:val="28"/>
           <w:szCs w:val="28"/>
         </w:rPr>
-      </w:pPr>
-      <w:r>
+      </w:r>
+    </w:p>
+    <w:p>
+      <w:pPr>
+        <w:pStyle w:val="PlainText"/>
+        <w:jc w:val="center"/>
         <w:rPr>
           <w:rFonts w:ascii="Times New Roman" w:hAnsi="Times New Roman"/>
           <w:sz w:val="28"/>
           <w:szCs w:val="28"/>
         </w:rPr>
+      </w:pPr>
+      <w:r>
+        <w:rPr>
+          <w:rFonts w:ascii="Times New Roman" w:hAnsi="Times New Roman"/>
+          <w:sz w:val="28"/>
+          <w:szCs w:val="28"/>
+        </w:rPr>
+      </w:r>
+    </w:p>
+    <w:p>
+      <w:pPr>
+        <w:pStyle w:val="PlainText"/>
+        <w:jc w:val="center"/>
+        <w:rPr>
+          <w:rFonts w:ascii="Times New Roman" w:hAnsi="Times New Roman"/>
+          <w:sz w:val="28"/>
+          <w:szCs w:val="28"/>
+        </w:rPr>
+      </w:pPr>
+      <w:r>
+        <w:rPr>
+          <w:rFonts w:ascii="Times New Roman" w:hAnsi="Times New Roman"/>
+          <w:sz w:val="28"/>
+          <w:szCs w:val="28"/>
+        </w:rPr>
         <w:t>Владимир, 2025 г.</w:t>
       </w:r>
       <w:r>
@@ -931,25 +1091,26 @@
     </w:p>
     <w:p>
       <w:pPr>
-        <w:spacing w:line="360" w:lineRule="auto"/>
-        <w:jc w:val="center"/>
-        <w:rPr>
-          <w:sz w:val="28"/>
-          <w:szCs w:val="28"/>
-        </w:rPr>
-      </w:pPr>
-      <w:r>
-        <w:rPr>
-          <w:sz w:val="28"/>
-          <w:szCs w:val="28"/>
-        </w:rPr>
-        <w:lastRenderedPageBreak/>
+        <w:pStyle w:val="Normal"/>
+        <w:spacing w:lineRule="auto" w:line="360" w:before="0" w:after="0"/>
+        <w:jc w:val="center"/>
+        <w:rPr>
+          <w:sz w:val="28"/>
+          <w:szCs w:val="28"/>
+        </w:rPr>
+      </w:pPr>
+      <w:r>
+        <w:rPr>
+          <w:sz w:val="28"/>
+          <w:szCs w:val="28"/>
+        </w:rPr>
         <w:t>ЦЕЛЬ РАБОТЫ:</w:t>
       </w:r>
     </w:p>
     <w:p>
       <w:pPr>
-        <w:spacing w:line="360" w:lineRule="auto"/>
+        <w:pStyle w:val="Normal"/>
+        <w:spacing w:lineRule="auto" w:line="360"/>
         <w:ind w:firstLine="709"/>
         <w:jc w:val="both"/>
         <w:rPr>
@@ -1004,7 +1165,8 @@
     </w:p>
     <w:p>
       <w:pPr>
-        <w:spacing w:line="360" w:lineRule="auto"/>
+        <w:pStyle w:val="Normal"/>
+        <w:spacing w:lineRule="auto" w:line="360"/>
         <w:jc w:val="center"/>
         <w:rPr>
           <w:sz w:val="28"/>
@@ -1019,7 +1181,8 @@
     </w:p>
     <w:p>
       <w:pPr>
-        <w:spacing w:line="360" w:lineRule="auto"/>
+        <w:pStyle w:val="Normal"/>
+        <w:spacing w:lineRule="auto" w:line="360"/>
         <w:ind w:firstLine="709"/>
         <w:jc w:val="both"/>
         <w:rPr>
@@ -1030,79 +1193,13 @@
         <w:rPr>
           <w:sz w:val="28"/>
         </w:rPr>
-        <w:t>Настро</w:t>
-      </w:r>
-      <w:r>
-        <w:rPr>
-          <w:sz w:val="28"/>
-        </w:rPr>
-        <w:t>ить</w:t>
-      </w:r>
-      <w:r>
-        <w:rPr>
-          <w:sz w:val="28"/>
-        </w:rPr>
-        <w:t xml:space="preserve"> </w:t>
-      </w:r>
-      <w:proofErr w:type="spellStart"/>
-      <w:r>
-        <w:rPr>
-          <w:sz w:val="28"/>
-        </w:rPr>
-        <w:t>VirtualHost</w:t>
-      </w:r>
-      <w:proofErr w:type="spellEnd"/>
-      <w:r>
-        <w:rPr>
-          <w:sz w:val="28"/>
-        </w:rPr>
-        <w:t xml:space="preserve">: </w:t>
-      </w:r>
-      <w:r>
-        <w:rPr>
-          <w:sz w:val="28"/>
-        </w:rPr>
-        <w:t>з</w:t>
-      </w:r>
-      <w:r>
-        <w:rPr>
-          <w:sz w:val="28"/>
-        </w:rPr>
-        <w:t xml:space="preserve">апретить скачивать файлы-мультимедиа (mp3, </w:t>
-      </w:r>
-      <w:proofErr w:type="spellStart"/>
-      <w:r>
-        <w:rPr>
-          <w:sz w:val="28"/>
-        </w:rPr>
-        <w:t>avi</w:t>
-      </w:r>
-      <w:proofErr w:type="spellEnd"/>
-      <w:r>
-        <w:rPr>
-          <w:sz w:val="28"/>
-        </w:rPr>
-        <w:t>). Реализовать CGI скрипт — вывод таблицы переданных параметров методом GET.</w:t>
-      </w:r>
-    </w:p>
-    <w:p>
-      <w:pPr>
-        <w:spacing w:line="360" w:lineRule="auto"/>
-        <w:jc w:val="center"/>
-        <w:rPr>
-          <w:sz w:val="28"/>
-        </w:rPr>
-      </w:pPr>
-      <w:r>
-        <w:rPr>
-          <w:sz w:val="28"/>
-        </w:rPr>
-        <w:t>ВЫПОЛНЕНИЕ РАБОТЫ:</w:t>
-      </w:r>
-    </w:p>
-    <w:p>
-      <w:pPr>
-        <w:spacing w:line="360" w:lineRule="auto"/>
+        <w:t>1. Изучить интерфейс программы Wireshark</w:t>
+      </w:r>
+    </w:p>
+    <w:p>
+      <w:pPr>
+        <w:pStyle w:val="Normal"/>
+        <w:spacing w:lineRule="auto" w:line="360"/>
         <w:ind w:firstLine="709"/>
         <w:jc w:val="both"/>
         <w:rPr>
@@ -1113,38 +1210,12 @@
         <w:rPr>
           <w:sz w:val="28"/>
         </w:rPr>
-        <w:t xml:space="preserve">Данная лабораторная работа выполнялась на операционной системе </w:t>
-      </w:r>
-      <w:r>
-        <w:rPr>
-          <w:sz w:val="28"/>
-          <w:lang w:val="en-US"/>
-        </w:rPr>
-        <w:t>Windows 10</w:t>
-      </w:r>
-      <w:r>
-        <w:rPr>
-          <w:sz w:val="28"/>
-        </w:rPr>
-        <w:t xml:space="preserve"> и в терминале «</w:t>
-      </w:r>
-      <w:r>
-        <w:rPr>
-          <w:sz w:val="28"/>
-          <w:lang w:val="en-US"/>
-        </w:rPr>
-        <w:t>PowerShell</w:t>
-      </w:r>
-      <w:r>
-        <w:rPr>
-          <w:sz w:val="28"/>
-        </w:rPr>
-        <w:t>».</w:t>
-      </w:r>
-    </w:p>
-    <w:p>
-      <w:pPr>
-        <w:spacing w:line="360" w:lineRule="auto"/>
+      </w:r>
+    </w:p>
+    <w:p>
+      <w:pPr>
+        <w:pStyle w:val="Normal"/>
+        <w:spacing w:lineRule="auto" w:line="360"/>
         <w:ind w:firstLine="709"/>
         <w:jc w:val="both"/>
         <w:rPr>
@@ -1155,150 +1226,29 @@
         <w:rPr>
           <w:sz w:val="28"/>
         </w:rPr>
-        <w:t xml:space="preserve">Вначале выполнения данной лабораторной работы </w:t>
-      </w:r>
-      <w:r>
-        <w:rPr>
-          <w:sz w:val="28"/>
-        </w:rPr>
-        <w:t xml:space="preserve">я установил веб-сервер </w:t>
-      </w:r>
-      <w:r>
-        <w:rPr>
-          <w:sz w:val="28"/>
-          <w:lang w:val="en-US"/>
-        </w:rPr>
-        <w:t xml:space="preserve">Apache </w:t>
-      </w:r>
-      <w:r>
-        <w:rPr>
-          <w:sz w:val="28"/>
-        </w:rPr>
-        <w:t xml:space="preserve">через официальный сайт и отредактировал конфиги </w:t>
-      </w:r>
-      <w:proofErr w:type="spellStart"/>
-      <w:r>
-        <w:rPr>
-          <w:sz w:val="28"/>
-          <w:lang w:val="en-US"/>
-        </w:rPr>
-        <w:t>httpd.conf</w:t>
-      </w:r>
-      <w:proofErr w:type="spellEnd"/>
-      <w:r>
-        <w:rPr>
-          <w:sz w:val="28"/>
-          <w:lang w:val="en-US"/>
-        </w:rPr>
-        <w:t xml:space="preserve"> </w:t>
-      </w:r>
-      <w:r>
-        <w:rPr>
-          <w:sz w:val="28"/>
-        </w:rPr>
-        <w:t xml:space="preserve">и </w:t>
-      </w:r>
-      <w:proofErr w:type="spellStart"/>
-      <w:r>
-        <w:rPr>
-          <w:sz w:val="28"/>
-        </w:rPr>
-        <w:t>httpd-vhosts.conf</w:t>
-      </w:r>
-      <w:proofErr w:type="spellEnd"/>
-      <w:r>
-        <w:rPr>
-          <w:sz w:val="28"/>
-          <w:lang w:val="en-US"/>
-        </w:rPr>
-        <w:t xml:space="preserve"> </w:t>
-      </w:r>
-      <w:r>
-        <w:rPr>
-          <w:sz w:val="28"/>
-        </w:rPr>
-        <w:t xml:space="preserve">в соответствии с методическим указанием. </w:t>
-      </w:r>
-    </w:p>
-    <w:p>
-      <w:pPr>
-        <w:spacing w:line="360" w:lineRule="auto"/>
+        <w:t>2. Захватить 100 произвольных пакетов. Определить статистические данные:</w:t>
+      </w:r>
+    </w:p>
+    <w:p>
+      <w:pPr>
+        <w:pStyle w:val="Normal"/>
+        <w:spacing w:lineRule="auto" w:line="360"/>
         <w:ind w:firstLine="709"/>
         <w:jc w:val="both"/>
         <w:rPr>
           <w:sz w:val="28"/>
         </w:rPr>
       </w:pPr>
-    </w:p>
-    <w:p>
-      <w:pPr>
-        <w:spacing w:line="360" w:lineRule="auto"/>
-        <w:jc w:val="center"/>
-        <w:rPr>
-          <w:sz w:val="28"/>
-          <w:szCs w:val="28"/>
-        </w:rPr>
-      </w:pPr>
-      <w:r>
-        <w:rPr>
-          <w:sz w:val="28"/>
-          <w:szCs w:val="28"/>
-        </w:rPr>
-        <w:t xml:space="preserve">Рисунок 1. </w:t>
-      </w:r>
-      <w:r>
-        <w:rPr>
-          <w:sz w:val="28"/>
-          <w:szCs w:val="28"/>
-        </w:rPr>
-        <w:t xml:space="preserve">Создание службы </w:t>
-      </w:r>
-      <w:r>
-        <w:rPr>
-          <w:sz w:val="28"/>
-          <w:szCs w:val="28"/>
-          <w:lang w:val="en-US"/>
-        </w:rPr>
-        <w:t>Apache2.4</w:t>
-      </w:r>
-      <w:r>
-        <w:rPr>
-          <w:sz w:val="28"/>
-          <w:szCs w:val="28"/>
-        </w:rPr>
-        <w:t>.</w:t>
-      </w:r>
-    </w:p>
-    <w:p>
-      <w:pPr>
-        <w:spacing w:line="360" w:lineRule="auto"/>
-        <w:jc w:val="center"/>
-        <w:rPr>
-          <w:sz w:val="28"/>
-          <w:szCs w:val="28"/>
-        </w:rPr>
-      </w:pPr>
-    </w:p>
-    <w:p>
-      <w:pPr>
-        <w:spacing w:line="360" w:lineRule="auto"/>
-        <w:jc w:val="center"/>
-        <w:rPr>
-          <w:sz w:val="28"/>
-          <w:szCs w:val="28"/>
-        </w:rPr>
-      </w:pPr>
-      <w:r>
-        <w:rPr>
-          <w:sz w:val="28"/>
-          <w:szCs w:val="28"/>
-        </w:rPr>
-        <w:t>ВЫВОД К РАБОТЕ:</w:t>
-      </w:r>
-    </w:p>
-    <w:p>
-      <w:pPr>
-        <w:spacing w:line="360" w:lineRule="auto"/>
+      <w:r>
+        <w:rPr>
+          <w:sz w:val="28"/>
+        </w:rPr>
+      </w:r>
+    </w:p>
+    <w:p>
+      <w:pPr>
+        <w:pStyle w:val="Normal"/>
+        <w:spacing w:lineRule="auto" w:line="360"/>
         <w:ind w:firstLine="709"/>
         <w:jc w:val="both"/>
         <w:rPr>
@@ -1309,62 +1259,1753 @@
         <w:rPr>
           <w:sz w:val="28"/>
         </w:rPr>
-        <w:t>Я у</w:t>
-      </w:r>
-      <w:r>
-        <w:rPr>
-          <w:sz w:val="28"/>
-        </w:rPr>
-        <w:t>зна</w:t>
-      </w:r>
-      <w:r>
-        <w:rPr>
-          <w:sz w:val="28"/>
-        </w:rPr>
-        <w:t>л</w:t>
-      </w:r>
-      <w:r>
-        <w:rPr>
-          <w:sz w:val="28"/>
-        </w:rPr>
-        <w:t xml:space="preserve"> принципы анализа сетевого трафика. Научи</w:t>
-      </w:r>
-      <w:r>
-        <w:rPr>
-          <w:sz w:val="28"/>
-        </w:rPr>
-        <w:t>л</w:t>
-      </w:r>
-      <w:r>
-        <w:rPr>
-          <w:sz w:val="28"/>
-        </w:rPr>
-        <w:t xml:space="preserve">ся использовать сетевой анализатор (сниффер </w:t>
+        <w:t>процентное соотношение трафика разных протоколов в сети;</w:t>
+      </w:r>
+    </w:p>
+    <w:p>
+      <w:pPr>
+        <w:pStyle w:val="Normal"/>
+        <w:spacing w:lineRule="auto" w:line="360"/>
+        <w:ind w:firstLine="709"/>
+        <w:jc w:val="both"/>
+        <w:rPr>
+          <w:sz w:val="28"/>
+        </w:rPr>
+      </w:pPr>
+      <w:r>
+        <w:rPr>
+          <w:sz w:val="28"/>
+        </w:rPr>
+      </w:r>
+    </w:p>
+    <w:p>
+      <w:pPr>
+        <w:pStyle w:val="Normal"/>
+        <w:spacing w:lineRule="auto" w:line="360"/>
+        <w:ind w:firstLine="709"/>
+        <w:jc w:val="both"/>
+        <w:rPr>
+          <w:sz w:val="28"/>
+        </w:rPr>
+      </w:pPr>
+      <w:r>
+        <w:rPr>
+          <w:sz w:val="28"/>
+        </w:rPr>
+        <w:t>среднюю скорость кадров/сек;</w:t>
+      </w:r>
+    </w:p>
+    <w:p>
+      <w:pPr>
+        <w:pStyle w:val="Normal"/>
+        <w:spacing w:lineRule="auto" w:line="360"/>
+        <w:ind w:firstLine="709"/>
+        <w:jc w:val="both"/>
+        <w:rPr>
+          <w:sz w:val="28"/>
+        </w:rPr>
+      </w:pPr>
+      <w:r>
+        <w:rPr>
+          <w:sz w:val="28"/>
+        </w:rPr>
+      </w:r>
+    </w:p>
+    <w:p>
+      <w:pPr>
+        <w:pStyle w:val="Normal"/>
+        <w:spacing w:lineRule="auto" w:line="360"/>
+        <w:ind w:firstLine="709"/>
+        <w:jc w:val="both"/>
+        <w:rPr>
+          <w:sz w:val="28"/>
+        </w:rPr>
+      </w:pPr>
+      <w:r>
+        <w:rPr>
+          <w:sz w:val="28"/>
+        </w:rPr>
+        <w:t>среднюю скорость байт/сек;</w:t>
+      </w:r>
+    </w:p>
+    <w:p>
+      <w:pPr>
+        <w:pStyle w:val="Normal"/>
+        <w:spacing w:lineRule="auto" w:line="360"/>
+        <w:ind w:firstLine="709"/>
+        <w:jc w:val="both"/>
+        <w:rPr>
+          <w:sz w:val="28"/>
+        </w:rPr>
+      </w:pPr>
+      <w:r>
+        <w:rPr>
+          <w:sz w:val="28"/>
+        </w:rPr>
+      </w:r>
+    </w:p>
+    <w:p>
+      <w:pPr>
+        <w:pStyle w:val="Normal"/>
+        <w:spacing w:lineRule="auto" w:line="360"/>
+        <w:ind w:firstLine="709"/>
+        <w:jc w:val="both"/>
+        <w:rPr>
+          <w:sz w:val="28"/>
+        </w:rPr>
+      </w:pPr>
+      <w:r>
+        <w:rPr>
+          <w:sz w:val="28"/>
+        </w:rPr>
+        <w:t>минимальный, максимальный и средний размеры пакета;</w:t>
+      </w:r>
+    </w:p>
+    <w:p>
+      <w:pPr>
+        <w:pStyle w:val="Normal"/>
+        <w:spacing w:lineRule="auto" w:line="360"/>
+        <w:ind w:firstLine="709"/>
+        <w:jc w:val="both"/>
+        <w:rPr>
+          <w:sz w:val="28"/>
+        </w:rPr>
+      </w:pPr>
+      <w:r>
+        <w:rPr>
+          <w:sz w:val="28"/>
+        </w:rPr>
+      </w:r>
+    </w:p>
+    <w:p>
+      <w:pPr>
+        <w:pStyle w:val="Normal"/>
+        <w:spacing w:lineRule="auto" w:line="360"/>
+        <w:ind w:firstLine="709"/>
+        <w:jc w:val="both"/>
+        <w:rPr>
+          <w:sz w:val="28"/>
+        </w:rPr>
+      </w:pPr>
+      <w:r>
+        <w:rPr>
+          <w:sz w:val="28"/>
+        </w:rPr>
+        <w:t>степень использования полосы пропускания канала (загрузку сети).</w:t>
+      </w:r>
+    </w:p>
+    <w:p>
+      <w:pPr>
+        <w:pStyle w:val="Normal"/>
+        <w:spacing w:lineRule="auto" w:line="360"/>
+        <w:ind w:firstLine="709"/>
+        <w:jc w:val="both"/>
+        <w:rPr>
+          <w:sz w:val="28"/>
+        </w:rPr>
+      </w:pPr>
+      <w:r>
+        <w:rPr>
+          <w:sz w:val="28"/>
+        </w:rPr>
+      </w:r>
+    </w:p>
+    <w:p>
+      <w:pPr>
+        <w:pStyle w:val="Normal"/>
+        <w:spacing w:lineRule="auto" w:line="360"/>
+        <w:ind w:firstLine="709"/>
+        <w:jc w:val="both"/>
+        <w:rPr>
+          <w:sz w:val="28"/>
+        </w:rPr>
+      </w:pPr>
+      <w:r>
+        <w:rPr>
+          <w:sz w:val="28"/>
+        </w:rPr>
+        <w:t>3. Зафиксировать 20 ІР-пакетов. Определить статистические данные:</w:t>
+      </w:r>
+    </w:p>
+    <w:p>
+      <w:pPr>
+        <w:pStyle w:val="Normal"/>
+        <w:spacing w:lineRule="auto" w:line="360"/>
+        <w:ind w:firstLine="709"/>
+        <w:jc w:val="both"/>
+        <w:rPr>
+          <w:sz w:val="28"/>
+        </w:rPr>
+      </w:pPr>
+      <w:r>
+        <w:rPr>
+          <w:sz w:val="28"/>
+        </w:rPr>
+      </w:r>
+    </w:p>
+    <w:p>
+      <w:pPr>
+        <w:pStyle w:val="Normal"/>
+        <w:spacing w:lineRule="auto" w:line="360"/>
+        <w:ind w:firstLine="709"/>
+        <w:jc w:val="both"/>
+        <w:rPr>
+          <w:sz w:val="28"/>
+        </w:rPr>
+      </w:pPr>
+      <w:r>
+        <w:rPr>
+          <w:sz w:val="28"/>
+        </w:rPr>
+        <w:t>процентное соотношение трафика разных протоколов стека tcp/ip в сети;</w:t>
+      </w:r>
+    </w:p>
+    <w:p>
+      <w:pPr>
+        <w:pStyle w:val="Normal"/>
+        <w:spacing w:lineRule="auto" w:line="360"/>
+        <w:ind w:firstLine="709"/>
+        <w:jc w:val="both"/>
+        <w:rPr>
+          <w:sz w:val="28"/>
+        </w:rPr>
+      </w:pPr>
+      <w:r>
+        <w:rPr>
+          <w:sz w:val="28"/>
+        </w:rPr>
+      </w:r>
+    </w:p>
+    <w:p>
+      <w:pPr>
+        <w:pStyle w:val="Normal"/>
+        <w:spacing w:lineRule="auto" w:line="360"/>
+        <w:ind w:firstLine="709"/>
+        <w:jc w:val="both"/>
+        <w:rPr>
+          <w:sz w:val="28"/>
+        </w:rPr>
+      </w:pPr>
+      <w:r>
+        <w:rPr>
+          <w:sz w:val="28"/>
+        </w:rPr>
+        <w:t>средний, минимальный, максимальный размеры пакета.</w:t>
+      </w:r>
+    </w:p>
+    <w:p>
+      <w:pPr>
+        <w:pStyle w:val="Normal"/>
+        <w:spacing w:lineRule="auto" w:line="360"/>
+        <w:ind w:firstLine="709"/>
+        <w:jc w:val="both"/>
+        <w:rPr>
+          <w:sz w:val="28"/>
+        </w:rPr>
+      </w:pPr>
+      <w:r>
+        <w:rPr>
+          <w:sz w:val="28"/>
+        </w:rPr>
+      </w:r>
+    </w:p>
+    <w:p>
+      <w:pPr>
+        <w:pStyle w:val="Normal"/>
+        <w:spacing w:lineRule="auto" w:line="360"/>
+        <w:ind w:firstLine="709"/>
+        <w:jc w:val="both"/>
+        <w:rPr>
+          <w:sz w:val="28"/>
+        </w:rPr>
+      </w:pPr>
+      <w:r>
+        <w:rPr>
+          <w:sz w:val="28"/>
+        </w:rPr>
+        <w:t>4. Выполнить анализ ARP-протокола по примеру из методических указаний.</w:t>
+      </w:r>
+    </w:p>
+    <w:p>
+      <w:pPr>
+        <w:pStyle w:val="Normal"/>
+        <w:spacing w:lineRule="auto" w:line="360"/>
+        <w:ind w:firstLine="709"/>
+        <w:jc w:val="both"/>
+        <w:rPr>
+          <w:sz w:val="28"/>
+        </w:rPr>
+      </w:pPr>
+      <w:r>
+        <w:rPr>
+          <w:sz w:val="28"/>
+        </w:rPr>
+      </w:r>
+    </w:p>
+    <w:p>
+      <w:pPr>
+        <w:pStyle w:val="Normal"/>
+        <w:spacing w:lineRule="auto" w:line="360"/>
+        <w:ind w:firstLine="709"/>
+        <w:jc w:val="both"/>
+        <w:rPr>
+          <w:sz w:val="28"/>
+        </w:rPr>
+      </w:pPr>
+      <w:r>
+        <w:rPr>
+          <w:sz w:val="28"/>
+        </w:rPr>
+        <w:t>5. На примере любого ІР-пакета указать структуры протоколов Ethernet и IP, Отметить поля заголовков и описать их.</w:t>
+      </w:r>
+    </w:p>
+    <w:p>
+      <w:pPr>
+        <w:pStyle w:val="Normal"/>
+        <w:spacing w:lineRule="auto" w:line="360"/>
+        <w:ind w:firstLine="709"/>
+        <w:jc w:val="both"/>
+        <w:rPr>
+          <w:sz w:val="28"/>
+        </w:rPr>
+      </w:pPr>
+      <w:r>
+        <w:rPr>
+          <w:sz w:val="28"/>
+        </w:rPr>
+      </w:r>
+    </w:p>
+    <w:p>
+      <w:pPr>
+        <w:pStyle w:val="Normal"/>
+        <w:spacing w:lineRule="auto" w:line="360"/>
+        <w:ind w:firstLine="709"/>
+        <w:jc w:val="both"/>
+        <w:rPr>
+          <w:sz w:val="28"/>
+        </w:rPr>
+      </w:pPr>
+      <w:r>
+        <w:rPr>
+          <w:sz w:val="28"/>
+        </w:rPr>
+        <w:t>6. Проанализировать и описать принцип работы утилиты ping. При этом описать все протоколы, используемые утилитой. Описать все поля протоколов. Составить диаграмму взаимодействия машин работе утилиты ping. Примечание. Данная утилита использует протокол ICMP (RFC 792 и RFC 960). при</w:t>
+      </w:r>
+    </w:p>
+    <w:p>
+      <w:pPr>
+        <w:pStyle w:val="Normal"/>
+        <w:spacing w:lineRule="auto" w:line="360"/>
+        <w:jc w:val="center"/>
+        <w:rPr>
+          <w:sz w:val="28"/>
+        </w:rPr>
+      </w:pPr>
+      <w:r>
+        <w:rPr>
+          <w:sz w:val="28"/>
+        </w:rPr>
+        <w:t>ВЫПОЛНЕНИЕ РАБОТЫ:</w:t>
+      </w:r>
+    </w:p>
+    <w:p>
+      <w:pPr>
+        <w:pStyle w:val="Normal"/>
+        <w:spacing w:lineRule="auto" w:line="360"/>
+        <w:ind w:firstLine="709"/>
+        <w:jc w:val="both"/>
+        <w:rPr>
+          <w:sz w:val="28"/>
+        </w:rPr>
+      </w:pPr>
+      <w:r>
+        <w:rPr>
+          <w:sz w:val="28"/>
+        </w:rPr>
+        <w:t xml:space="preserve">Данная лабораторная работа выполнялась на операционной системе </w:t>
       </w:r>
       <w:r>
         <w:rPr>
           <w:sz w:val="28"/>
           <w:lang w:val="en-US"/>
         </w:rPr>
+        <w:t>Windows 10</w:t>
+      </w:r>
+      <w:r>
+        <w:rPr>
+          <w:sz w:val="28"/>
+        </w:rPr>
+        <w:t xml:space="preserve"> и в терминале «</w:t>
+      </w:r>
+      <w:r>
+        <w:rPr>
+          <w:sz w:val="28"/>
+          <w:lang w:val="en-US"/>
+        </w:rPr>
+        <w:t>PowerShell</w:t>
+      </w:r>
+      <w:r>
+        <w:rPr>
+          <w:sz w:val="28"/>
+        </w:rPr>
+        <w:t>».</w:t>
+      </w:r>
+    </w:p>
+    <w:p>
+      <w:pPr>
+        <w:pStyle w:val="Normal"/>
+        <w:spacing w:lineRule="auto" w:line="360"/>
+        <w:ind w:firstLine="709"/>
+        <w:jc w:val="both"/>
+        <w:rPr>
+          <w:sz w:val="28"/>
+        </w:rPr>
+      </w:pPr>
+      <w:r>
+        <w:rPr>
+          <w:sz w:val="28"/>
+        </w:rPr>
+        <w:t xml:space="preserve">Вначале выполнения данной лабораторной работы я установил веб-сервер </w:t>
+      </w:r>
+      <w:r>
+        <w:rPr>
+          <w:sz w:val="28"/>
+          <w:lang w:val="en-US"/>
+        </w:rPr>
+        <w:t xml:space="preserve">Apache </w:t>
+      </w:r>
+      <w:r>
+        <w:rPr>
+          <w:sz w:val="28"/>
+        </w:rPr>
+        <w:t xml:space="preserve">через официальный сайт и отредактировал конфиги </w:t>
+      </w:r>
+      <w:r>
+        <w:rPr>
+          <w:sz w:val="28"/>
+          <w:lang w:val="en-US"/>
+        </w:rPr>
+        <w:t xml:space="preserve">httpd.conf </w:t>
+      </w:r>
+      <w:r>
+        <w:rPr>
+          <w:sz w:val="28"/>
+        </w:rPr>
+        <w:t>и httpd-vhosts.conf</w:t>
+      </w:r>
+      <w:r>
+        <w:rPr>
+          <w:sz w:val="28"/>
+          <w:lang w:val="en-US"/>
+        </w:rPr>
+        <w:t xml:space="preserve"> </w:t>
+      </w:r>
+      <w:r>
+        <w:rPr>
+          <w:sz w:val="28"/>
+        </w:rPr>
+        <w:t xml:space="preserve">в соответствии с методическим указанием. </w:t>
+      </w:r>
+    </w:p>
+    <w:p>
+      <w:pPr>
+        <w:pStyle w:val="Normal"/>
+        <w:spacing w:lineRule="auto" w:line="360"/>
+        <w:ind w:hanging="0"/>
+        <w:jc w:val="both"/>
+        <w:rPr>
+          <w:sz w:val="28"/>
+        </w:rPr>
+      </w:pPr>
+      <w:r>
+        <w:rPr/>
+        <w:drawing>
+          <wp:inline distT="0" distB="0" distL="0" distR="0">
+            <wp:extent cx="5940425" cy="1815465"/>
+            <wp:effectExtent l="0" t="0" r="0" b="0"/>
+            <wp:docPr id="1" name="Image1" descr=""/>
+            <wp:cNvGraphicFramePr>
+              <a:graphicFrameLocks xmlns:a="http://schemas.openxmlformats.org/drawingml/2006/main" noChangeAspect="1"/>
+            </wp:cNvGraphicFramePr>
+            <a:graphic xmlns:a="http://schemas.openxmlformats.org/drawingml/2006/main">
+              <a:graphicData uri="http://schemas.openxmlformats.org/drawingml/2006/picture">
+                <pic:pic xmlns:pic="http://schemas.openxmlformats.org/drawingml/2006/picture">
+                  <pic:nvPicPr>
+                    <pic:cNvPr id="1" name="Image1" descr=""/>
+                    <pic:cNvPicPr>
+                      <a:picLocks noChangeAspect="1" noChangeArrowheads="1"/>
+                    </pic:cNvPicPr>
+                  </pic:nvPicPr>
+                  <pic:blipFill>
+                    <a:blip r:embed="rId2"/>
+                    <a:stretch>
+                      <a:fillRect/>
+                    </a:stretch>
+                  </pic:blipFill>
+                  <pic:spPr bwMode="auto">
+                    <a:xfrm>
+                      <a:off x="0" y="0"/>
+                      <a:ext cx="5940425" cy="1815465"/>
+                    </a:xfrm>
+                    <a:prstGeom prst="rect">
+                      <a:avLst/>
+                    </a:prstGeom>
+                  </pic:spPr>
+                </pic:pic>
+              </a:graphicData>
+            </a:graphic>
+          </wp:inline>
+        </w:drawing>
+      </w:r>
+    </w:p>
+    <w:p>
+      <w:pPr>
+        <w:pStyle w:val="Normal"/>
+        <w:spacing w:lineRule="auto" w:line="360"/>
+        <w:jc w:val="center"/>
+        <w:rPr>
+          <w:sz w:val="28"/>
+          <w:szCs w:val="28"/>
+        </w:rPr>
+      </w:pPr>
+      <w:r>
+        <w:rPr>
+          <w:sz w:val="28"/>
+          <w:szCs w:val="28"/>
+        </w:rPr>
+        <w:t xml:space="preserve">Рисунок 1. Создание службы </w:t>
+      </w:r>
+      <w:r>
+        <w:rPr>
+          <w:sz w:val="28"/>
+          <w:szCs w:val="28"/>
+          <w:lang w:val="en-US"/>
+        </w:rPr>
+        <w:t>Apache2.4</w:t>
+      </w:r>
+      <w:r>
+        <w:rPr>
+          <w:sz w:val="28"/>
+          <w:szCs w:val="28"/>
+        </w:rPr>
+        <w:t>.</w:t>
+      </w:r>
+    </w:p>
+    <w:p>
+      <w:pPr>
+        <w:pStyle w:val="Normal"/>
+        <w:spacing w:lineRule="auto" w:line="360"/>
+        <w:jc w:val="center"/>
+        <w:rPr>
+          <w:sz w:val="28"/>
+          <w:szCs w:val="28"/>
+        </w:rPr>
+      </w:pPr>
+      <w:r>
+        <w:rPr/>
+        <w:drawing>
+          <wp:inline distT="0" distB="0" distL="0" distR="0">
+            <wp:extent cx="5940425" cy="3857625"/>
+            <wp:effectExtent l="0" t="0" r="0" b="0"/>
+            <wp:docPr id="2" name="Image2" descr=""/>
+            <wp:cNvGraphicFramePr>
+              <a:graphicFrameLocks xmlns:a="http://schemas.openxmlformats.org/drawingml/2006/main" noChangeAspect="1"/>
+            </wp:cNvGraphicFramePr>
+            <a:graphic xmlns:a="http://schemas.openxmlformats.org/drawingml/2006/main">
+              <a:graphicData uri="http://schemas.openxmlformats.org/drawingml/2006/picture">
+                <pic:pic xmlns:pic="http://schemas.openxmlformats.org/drawingml/2006/picture">
+                  <pic:nvPicPr>
+                    <pic:cNvPr id="2" name="Image2" descr=""/>
+                    <pic:cNvPicPr>
+                      <a:picLocks noChangeAspect="1" noChangeArrowheads="1"/>
+                    </pic:cNvPicPr>
+                  </pic:nvPicPr>
+                  <pic:blipFill>
+                    <a:blip r:embed="rId3"/>
+                    <a:stretch>
+                      <a:fillRect/>
+                    </a:stretch>
+                  </pic:blipFill>
+                  <pic:spPr bwMode="auto">
+                    <a:xfrm>
+                      <a:off x="0" y="0"/>
+                      <a:ext cx="5940425" cy="3857625"/>
+                    </a:xfrm>
+                    <a:prstGeom prst="rect">
+                      <a:avLst/>
+                    </a:prstGeom>
+                  </pic:spPr>
+                </pic:pic>
+              </a:graphicData>
+            </a:graphic>
+          </wp:inline>
+        </w:drawing>
+      </w:r>
+    </w:p>
+    <w:p>
+      <w:pPr>
+        <w:pStyle w:val="Normal"/>
+        <w:spacing w:lineRule="auto" w:line="360"/>
+        <w:jc w:val="center"/>
+        <w:rPr>
+          <w:sz w:val="28"/>
+          <w:szCs w:val="28"/>
+        </w:rPr>
+      </w:pPr>
+      <w:r>
+        <w:rPr>
+          <w:sz w:val="28"/>
+          <w:szCs w:val="28"/>
+        </w:rPr>
+        <w:drawing>
+          <wp:inline distT="0" distB="0" distL="0" distR="0">
+            <wp:extent cx="5940425" cy="3472815"/>
+            <wp:effectExtent l="0" t="0" r="0" b="0"/>
+            <wp:docPr id="3" name="Image3" descr=""/>
+            <wp:cNvGraphicFramePr>
+              <a:graphicFrameLocks xmlns:a="http://schemas.openxmlformats.org/drawingml/2006/main" noChangeAspect="1"/>
+            </wp:cNvGraphicFramePr>
+            <a:graphic xmlns:a="http://schemas.openxmlformats.org/drawingml/2006/main">
+              <a:graphicData uri="http://schemas.openxmlformats.org/drawingml/2006/picture">
+                <pic:pic xmlns:pic="http://schemas.openxmlformats.org/drawingml/2006/picture">
+                  <pic:nvPicPr>
+                    <pic:cNvPr id="3" name="Image3" descr=""/>
+                    <pic:cNvPicPr>
+                      <a:picLocks noChangeAspect="1" noChangeArrowheads="1"/>
+                    </pic:cNvPicPr>
+                  </pic:nvPicPr>
+                  <pic:blipFill>
+                    <a:blip r:embed="rId4"/>
+                    <a:stretch>
+                      <a:fillRect/>
+                    </a:stretch>
+                  </pic:blipFill>
+                  <pic:spPr bwMode="auto">
+                    <a:xfrm>
+                      <a:off x="0" y="0"/>
+                      <a:ext cx="5940425" cy="3472815"/>
+                    </a:xfrm>
+                    <a:prstGeom prst="rect">
+                      <a:avLst/>
+                    </a:prstGeom>
+                  </pic:spPr>
+                </pic:pic>
+              </a:graphicData>
+            </a:graphic>
+          </wp:inline>
+        </w:drawing>
+      </w:r>
+    </w:p>
+    <w:p>
+      <w:pPr>
+        <w:pStyle w:val="Normal"/>
+        <w:spacing w:lineRule="auto" w:line="360"/>
+        <w:jc w:val="center"/>
+        <w:rPr>
+          <w:sz w:val="28"/>
+          <w:szCs w:val="28"/>
+        </w:rPr>
+      </w:pPr>
+      <w:r>
+        <w:rPr>
+          <w:sz w:val="28"/>
+          <w:szCs w:val="28"/>
+        </w:rPr>
+        <w:t xml:space="preserve">Получить статистику со </w:t>
+      </w:r>
+      <w:r>
+        <w:rPr>
+          <w:sz w:val="28"/>
+          <w:szCs w:val="28"/>
+        </w:rPr>
+        <w:t>100 пакетов</w:t>
+      </w:r>
+    </w:p>
+    <w:p>
+      <w:pPr>
+        <w:pStyle w:val="Normal"/>
+        <w:spacing w:lineRule="auto" w:line="360"/>
+        <w:jc w:val="center"/>
+        <w:rPr>
+          <w:sz w:val="28"/>
+          <w:szCs w:val="28"/>
+        </w:rPr>
+      </w:pPr>
+      <w:r>
+        <w:rPr>
+          <w:sz w:val="28"/>
+          <w:szCs w:val="28"/>
+        </w:rPr>
+      </w:r>
+    </w:p>
+    <w:p>
+      <w:pPr>
+        <w:pStyle w:val="Normal"/>
+        <w:spacing w:lineRule="auto" w:line="360"/>
+        <w:jc w:val="center"/>
+        <w:rPr>
+          <w:sz w:val="28"/>
+          <w:szCs w:val="28"/>
+        </w:rPr>
+      </w:pPr>
+      <w:r>
+        <w:rPr>
+          <w:sz w:val="28"/>
+          <w:szCs w:val="28"/>
+        </w:rPr>
+        <w:drawing>
+          <wp:inline distT="0" distB="0" distL="0" distR="0">
+            <wp:extent cx="5940425" cy="3855085"/>
+            <wp:effectExtent l="0" t="0" r="0" b="0"/>
+            <wp:docPr id="4" name="Image4" descr=""/>
+            <wp:cNvGraphicFramePr>
+              <a:graphicFrameLocks xmlns:a="http://schemas.openxmlformats.org/drawingml/2006/main" noChangeAspect="1"/>
+            </wp:cNvGraphicFramePr>
+            <a:graphic xmlns:a="http://schemas.openxmlformats.org/drawingml/2006/main">
+              <a:graphicData uri="http://schemas.openxmlformats.org/drawingml/2006/picture">
+                <pic:pic xmlns:pic="http://schemas.openxmlformats.org/drawingml/2006/picture">
+                  <pic:nvPicPr>
+                    <pic:cNvPr id="4" name="Image4" descr=""/>
+                    <pic:cNvPicPr>
+                      <a:picLocks noChangeAspect="1" noChangeArrowheads="1"/>
+                    </pic:cNvPicPr>
+                  </pic:nvPicPr>
+                  <pic:blipFill>
+                    <a:blip r:embed="rId5"/>
+                    <a:stretch>
+                      <a:fillRect/>
+                    </a:stretch>
+                  </pic:blipFill>
+                  <pic:spPr bwMode="auto">
+                    <a:xfrm>
+                      <a:off x="0" y="0"/>
+                      <a:ext cx="5940425" cy="3855085"/>
+                    </a:xfrm>
+                    <a:prstGeom prst="rect">
+                      <a:avLst/>
+                    </a:prstGeom>
+                  </pic:spPr>
+                </pic:pic>
+              </a:graphicData>
+            </a:graphic>
+          </wp:inline>
+        </w:drawing>
+      </w:r>
+    </w:p>
+    <w:p>
+      <w:pPr>
+        <w:pStyle w:val="Normal"/>
+        <w:spacing w:lineRule="auto" w:line="360"/>
+        <w:jc w:val="center"/>
+        <w:rPr>
+          <w:sz w:val="28"/>
+          <w:szCs w:val="28"/>
+        </w:rPr>
+      </w:pPr>
+      <w:r>
+        <w:rPr>
+          <w:sz w:val="28"/>
+          <w:szCs w:val="28"/>
+        </w:rPr>
+        <w:drawing>
+          <wp:inline distT="0" distB="0" distL="0" distR="0">
+            <wp:extent cx="5940425" cy="3984625"/>
+            <wp:effectExtent l="0" t="0" r="0" b="0"/>
+            <wp:docPr id="5" name="Image5" descr=""/>
+            <wp:cNvGraphicFramePr>
+              <a:graphicFrameLocks xmlns:a="http://schemas.openxmlformats.org/drawingml/2006/main" noChangeAspect="1"/>
+            </wp:cNvGraphicFramePr>
+            <a:graphic xmlns:a="http://schemas.openxmlformats.org/drawingml/2006/main">
+              <a:graphicData uri="http://schemas.openxmlformats.org/drawingml/2006/picture">
+                <pic:pic xmlns:pic="http://schemas.openxmlformats.org/drawingml/2006/picture">
+                  <pic:nvPicPr>
+                    <pic:cNvPr id="5" name="Image5" descr=""/>
+                    <pic:cNvPicPr>
+                      <a:picLocks noChangeAspect="1" noChangeArrowheads="1"/>
+                    </pic:cNvPicPr>
+                  </pic:nvPicPr>
+                  <pic:blipFill>
+                    <a:blip r:embed="rId6"/>
+                    <a:stretch>
+                      <a:fillRect/>
+                    </a:stretch>
+                  </pic:blipFill>
+                  <pic:spPr bwMode="auto">
+                    <a:xfrm>
+                      <a:off x="0" y="0"/>
+                      <a:ext cx="5940425" cy="3984625"/>
+                    </a:xfrm>
+                    <a:prstGeom prst="rect">
+                      <a:avLst/>
+                    </a:prstGeom>
+                  </pic:spPr>
+                </pic:pic>
+              </a:graphicData>
+            </a:graphic>
+          </wp:inline>
+        </w:drawing>
+      </w:r>
+    </w:p>
+    <w:p>
+      <w:pPr>
+        <w:pStyle w:val="Normal"/>
+        <w:spacing w:lineRule="auto" w:line="360"/>
+        <w:jc w:val="center"/>
+        <w:rPr>
+          <w:sz w:val="28"/>
+          <w:szCs w:val="28"/>
+        </w:rPr>
+      </w:pPr>
+      <w:r>
+        <w:rPr>
+          <w:sz w:val="28"/>
+          <w:szCs w:val="28"/>
+        </w:rPr>
+        <w:drawing>
+          <wp:inline distT="0" distB="0" distL="0" distR="0">
+            <wp:extent cx="5940425" cy="5576570"/>
+            <wp:effectExtent l="0" t="0" r="0" b="0"/>
+            <wp:docPr id="6" name="Image6" descr=""/>
+            <wp:cNvGraphicFramePr>
+              <a:graphicFrameLocks xmlns:a="http://schemas.openxmlformats.org/drawingml/2006/main" noChangeAspect="1"/>
+            </wp:cNvGraphicFramePr>
+            <a:graphic xmlns:a="http://schemas.openxmlformats.org/drawingml/2006/main">
+              <a:graphicData uri="http://schemas.openxmlformats.org/drawingml/2006/picture">
+                <pic:pic xmlns:pic="http://schemas.openxmlformats.org/drawingml/2006/picture">
+                  <pic:nvPicPr>
+                    <pic:cNvPr id="6" name="Image6" descr=""/>
+                    <pic:cNvPicPr>
+                      <a:picLocks noChangeAspect="1" noChangeArrowheads="1"/>
+                    </pic:cNvPicPr>
+                  </pic:nvPicPr>
+                  <pic:blipFill>
+                    <a:blip r:embed="rId7"/>
+                    <a:stretch>
+                      <a:fillRect/>
+                    </a:stretch>
+                  </pic:blipFill>
+                  <pic:spPr bwMode="auto">
+                    <a:xfrm>
+                      <a:off x="0" y="0"/>
+                      <a:ext cx="5940425" cy="5576570"/>
+                    </a:xfrm>
+                    <a:prstGeom prst="rect">
+                      <a:avLst/>
+                    </a:prstGeom>
+                  </pic:spPr>
+                </pic:pic>
+              </a:graphicData>
+            </a:graphic>
+          </wp:inline>
+        </w:drawing>
+      </w:r>
+    </w:p>
+    <w:p>
+      <w:pPr>
+        <w:pStyle w:val="Normal"/>
+        <w:spacing w:lineRule="auto" w:line="360"/>
+        <w:jc w:val="center"/>
+        <w:rPr>
+          <w:sz w:val="28"/>
+          <w:szCs w:val="28"/>
+        </w:rPr>
+      </w:pPr>
+      <w:r>
+        <w:rPr>
+          <w:sz w:val="28"/>
+          <w:szCs w:val="28"/>
+        </w:rPr>
+        <w:drawing>
+          <wp:inline distT="0" distB="0" distL="0" distR="0">
+            <wp:extent cx="5940425" cy="4006215"/>
+            <wp:effectExtent l="0" t="0" r="0" b="0"/>
+            <wp:docPr id="7" name="Image7" descr=""/>
+            <wp:cNvGraphicFramePr>
+              <a:graphicFrameLocks xmlns:a="http://schemas.openxmlformats.org/drawingml/2006/main" noChangeAspect="1"/>
+            </wp:cNvGraphicFramePr>
+            <a:graphic xmlns:a="http://schemas.openxmlformats.org/drawingml/2006/main">
+              <a:graphicData uri="http://schemas.openxmlformats.org/drawingml/2006/picture">
+                <pic:pic xmlns:pic="http://schemas.openxmlformats.org/drawingml/2006/picture">
+                  <pic:nvPicPr>
+                    <pic:cNvPr id="7" name="Image7" descr=""/>
+                    <pic:cNvPicPr>
+                      <a:picLocks noChangeAspect="1" noChangeArrowheads="1"/>
+                    </pic:cNvPicPr>
+                  </pic:nvPicPr>
+                  <pic:blipFill>
+                    <a:blip r:embed="rId8"/>
+                    <a:stretch>
+                      <a:fillRect/>
+                    </a:stretch>
+                  </pic:blipFill>
+                  <pic:spPr bwMode="auto">
+                    <a:xfrm>
+                      <a:off x="0" y="0"/>
+                      <a:ext cx="5940425" cy="4006215"/>
+                    </a:xfrm>
+                    <a:prstGeom prst="rect">
+                      <a:avLst/>
+                    </a:prstGeom>
+                  </pic:spPr>
+                </pic:pic>
+              </a:graphicData>
+            </a:graphic>
+          </wp:inline>
+        </w:drawing>
+      </w:r>
+    </w:p>
+    <w:p>
+      <w:pPr>
+        <w:pStyle w:val="Normal"/>
+        <w:spacing w:lineRule="auto" w:line="360"/>
+        <w:jc w:val="center"/>
+        <w:rPr>
+          <w:sz w:val="28"/>
+          <w:szCs w:val="28"/>
+        </w:rPr>
+      </w:pPr>
+      <w:r>
+        <w:rPr>
+          <w:sz w:val="28"/>
+          <w:szCs w:val="28"/>
+        </w:rPr>
+        <w:drawing>
+          <wp:inline distT="0" distB="0" distL="0" distR="0">
+            <wp:extent cx="5940425" cy="3574415"/>
+            <wp:effectExtent l="0" t="0" r="0" b="0"/>
+            <wp:docPr id="8" name="Image8" descr=""/>
+            <wp:cNvGraphicFramePr>
+              <a:graphicFrameLocks xmlns:a="http://schemas.openxmlformats.org/drawingml/2006/main" noChangeAspect="1"/>
+            </wp:cNvGraphicFramePr>
+            <a:graphic xmlns:a="http://schemas.openxmlformats.org/drawingml/2006/main">
+              <a:graphicData uri="http://schemas.openxmlformats.org/drawingml/2006/picture">
+                <pic:pic xmlns:pic="http://schemas.openxmlformats.org/drawingml/2006/picture">
+                  <pic:nvPicPr>
+                    <pic:cNvPr id="8" name="Image8" descr=""/>
+                    <pic:cNvPicPr>
+                      <a:picLocks noChangeAspect="1" noChangeArrowheads="1"/>
+                    </pic:cNvPicPr>
+                  </pic:nvPicPr>
+                  <pic:blipFill>
+                    <a:blip r:embed="rId9"/>
+                    <a:stretch>
+                      <a:fillRect/>
+                    </a:stretch>
+                  </pic:blipFill>
+                  <pic:spPr bwMode="auto">
+                    <a:xfrm>
+                      <a:off x="0" y="0"/>
+                      <a:ext cx="5940425" cy="3574415"/>
+                    </a:xfrm>
+                    <a:prstGeom prst="rect">
+                      <a:avLst/>
+                    </a:prstGeom>
+                  </pic:spPr>
+                </pic:pic>
+              </a:graphicData>
+            </a:graphic>
+          </wp:inline>
+        </w:drawing>
+      </w:r>
+    </w:p>
+    <w:p>
+      <w:pPr>
+        <w:pStyle w:val="Normal"/>
+        <w:spacing w:lineRule="auto" w:line="360"/>
+        <w:jc w:val="center"/>
+        <w:rPr>
+          <w:sz w:val="28"/>
+          <w:szCs w:val="28"/>
+        </w:rPr>
+      </w:pPr>
+      <w:r>
+        <w:rPr>
+          <w:sz w:val="28"/>
+          <w:szCs w:val="28"/>
+        </w:rPr>
+        <w:t xml:space="preserve">Получить статистику с </w:t>
+      </w:r>
+      <w:r>
+        <w:rPr>
+          <w:sz w:val="28"/>
+          <w:szCs w:val="28"/>
+        </w:rPr>
+        <w:t>20 IP пакетов</w:t>
+      </w:r>
+    </w:p>
+    <w:p>
+      <w:pPr>
+        <w:pStyle w:val="Normal"/>
+        <w:spacing w:lineRule="auto" w:line="360"/>
+        <w:jc w:val="center"/>
+        <w:rPr>
+          <w:sz w:val="28"/>
+          <w:szCs w:val="28"/>
+        </w:rPr>
+      </w:pPr>
+      <w:r>
+        <w:rPr>
+          <w:sz w:val="28"/>
+          <w:szCs w:val="28"/>
+        </w:rPr>
+        <w:drawing>
+          <wp:inline distT="0" distB="0" distL="0" distR="0">
+            <wp:extent cx="5940425" cy="3467735"/>
+            <wp:effectExtent l="0" t="0" r="0" b="0"/>
+            <wp:docPr id="9" name="Image9" descr=""/>
+            <wp:cNvGraphicFramePr>
+              <a:graphicFrameLocks xmlns:a="http://schemas.openxmlformats.org/drawingml/2006/main" noChangeAspect="1"/>
+            </wp:cNvGraphicFramePr>
+            <a:graphic xmlns:a="http://schemas.openxmlformats.org/drawingml/2006/main">
+              <a:graphicData uri="http://schemas.openxmlformats.org/drawingml/2006/picture">
+                <pic:pic xmlns:pic="http://schemas.openxmlformats.org/drawingml/2006/picture">
+                  <pic:nvPicPr>
+                    <pic:cNvPr id="9" name="Image9" descr=""/>
+                    <pic:cNvPicPr>
+                      <a:picLocks noChangeAspect="1" noChangeArrowheads="1"/>
+                    </pic:cNvPicPr>
+                  </pic:nvPicPr>
+                  <pic:blipFill>
+                    <a:blip r:embed="rId10"/>
+                    <a:stretch>
+                      <a:fillRect/>
+                    </a:stretch>
+                  </pic:blipFill>
+                  <pic:spPr bwMode="auto">
+                    <a:xfrm>
+                      <a:off x="0" y="0"/>
+                      <a:ext cx="5940425" cy="3467735"/>
+                    </a:xfrm>
+                    <a:prstGeom prst="rect">
+                      <a:avLst/>
+                    </a:prstGeom>
+                  </pic:spPr>
+                </pic:pic>
+              </a:graphicData>
+            </a:graphic>
+          </wp:inline>
+        </w:drawing>
+      </w:r>
+    </w:p>
+    <w:p>
+      <w:pPr>
+        <w:pStyle w:val="Normal"/>
+        <w:spacing w:lineRule="auto" w:line="360"/>
+        <w:jc w:val="center"/>
+        <w:rPr>
+          <w:sz w:val="28"/>
+          <w:szCs w:val="28"/>
+        </w:rPr>
+      </w:pPr>
+      <w:r>
+        <w:rPr>
+          <w:sz w:val="28"/>
+          <w:szCs w:val="28"/>
+        </w:rPr>
+        <w:drawing>
+          <wp:inline distT="0" distB="0" distL="0" distR="0">
+            <wp:extent cx="5940425" cy="3357245"/>
+            <wp:effectExtent l="0" t="0" r="0" b="0"/>
+            <wp:docPr id="10" name="Image10" descr=""/>
+            <wp:cNvGraphicFramePr>
+              <a:graphicFrameLocks xmlns:a="http://schemas.openxmlformats.org/drawingml/2006/main" noChangeAspect="1"/>
+            </wp:cNvGraphicFramePr>
+            <a:graphic xmlns:a="http://schemas.openxmlformats.org/drawingml/2006/main">
+              <a:graphicData uri="http://schemas.openxmlformats.org/drawingml/2006/picture">
+                <pic:pic xmlns:pic="http://schemas.openxmlformats.org/drawingml/2006/picture">
+                  <pic:nvPicPr>
+                    <pic:cNvPr id="10" name="Image10" descr=""/>
+                    <pic:cNvPicPr>
+                      <a:picLocks noChangeAspect="1" noChangeArrowheads="1"/>
+                    </pic:cNvPicPr>
+                  </pic:nvPicPr>
+                  <pic:blipFill>
+                    <a:blip r:embed="rId11"/>
+                    <a:stretch>
+                      <a:fillRect/>
+                    </a:stretch>
+                  </pic:blipFill>
+                  <pic:spPr bwMode="auto">
+                    <a:xfrm>
+                      <a:off x="0" y="0"/>
+                      <a:ext cx="5940425" cy="3357245"/>
+                    </a:xfrm>
+                    <a:prstGeom prst="rect">
+                      <a:avLst/>
+                    </a:prstGeom>
+                  </pic:spPr>
+                </pic:pic>
+              </a:graphicData>
+            </a:graphic>
+          </wp:inline>
+        </w:drawing>
+      </w:r>
+    </w:p>
+    <w:p>
+      <w:pPr>
+        <w:pStyle w:val="Normal"/>
+        <w:spacing w:lineRule="auto" w:line="360"/>
+        <w:jc w:val="center"/>
+        <w:rPr>
+          <w:sz w:val="28"/>
+          <w:szCs w:val="28"/>
+        </w:rPr>
+      </w:pPr>
+      <w:r>
+        <w:rPr>
+          <w:sz w:val="28"/>
+          <w:szCs w:val="28"/>
+        </w:rPr>
+        <w:drawing>
+          <wp:inline distT="0" distB="0" distL="0" distR="0">
+            <wp:extent cx="5940425" cy="4035425"/>
+            <wp:effectExtent l="0" t="0" r="0" b="0"/>
+            <wp:docPr id="11" name="Image11" descr=""/>
+            <wp:cNvGraphicFramePr>
+              <a:graphicFrameLocks xmlns:a="http://schemas.openxmlformats.org/drawingml/2006/main" noChangeAspect="1"/>
+            </wp:cNvGraphicFramePr>
+            <a:graphic xmlns:a="http://schemas.openxmlformats.org/drawingml/2006/main">
+              <a:graphicData uri="http://schemas.openxmlformats.org/drawingml/2006/picture">
+                <pic:pic xmlns:pic="http://schemas.openxmlformats.org/drawingml/2006/picture">
+                  <pic:nvPicPr>
+                    <pic:cNvPr id="11" name="Image11" descr=""/>
+                    <pic:cNvPicPr>
+                      <a:picLocks noChangeAspect="1" noChangeArrowheads="1"/>
+                    </pic:cNvPicPr>
+                  </pic:nvPicPr>
+                  <pic:blipFill>
+                    <a:blip r:embed="rId12"/>
+                    <a:stretch>
+                      <a:fillRect/>
+                    </a:stretch>
+                  </pic:blipFill>
+                  <pic:spPr bwMode="auto">
+                    <a:xfrm>
+                      <a:off x="0" y="0"/>
+                      <a:ext cx="5940425" cy="4035425"/>
+                    </a:xfrm>
+                    <a:prstGeom prst="rect">
+                      <a:avLst/>
+                    </a:prstGeom>
+                  </pic:spPr>
+                </pic:pic>
+              </a:graphicData>
+            </a:graphic>
+          </wp:inline>
+        </w:drawing>
+      </w:r>
+    </w:p>
+    <w:p>
+      <w:pPr>
+        <w:pStyle w:val="Normal"/>
+        <w:spacing w:lineRule="auto" w:line="360"/>
+        <w:jc w:val="center"/>
+        <w:rPr>
+          <w:sz w:val="28"/>
+          <w:szCs w:val="28"/>
+        </w:rPr>
+      </w:pPr>
+      <w:r>
+        <w:rPr>
+          <w:sz w:val="28"/>
+          <w:szCs w:val="28"/>
+        </w:rPr>
+        <w:drawing>
+          <wp:inline distT="0" distB="0" distL="0" distR="0">
+            <wp:extent cx="5940425" cy="3660775"/>
+            <wp:effectExtent l="0" t="0" r="0" b="0"/>
+            <wp:docPr id="12" name="Image12" descr=""/>
+            <wp:cNvGraphicFramePr>
+              <a:graphicFrameLocks xmlns:a="http://schemas.openxmlformats.org/drawingml/2006/main" noChangeAspect="1"/>
+            </wp:cNvGraphicFramePr>
+            <a:graphic xmlns:a="http://schemas.openxmlformats.org/drawingml/2006/main">
+              <a:graphicData uri="http://schemas.openxmlformats.org/drawingml/2006/picture">
+                <pic:pic xmlns:pic="http://schemas.openxmlformats.org/drawingml/2006/picture">
+                  <pic:nvPicPr>
+                    <pic:cNvPr id="12" name="Image12" descr=""/>
+                    <pic:cNvPicPr>
+                      <a:picLocks noChangeAspect="1" noChangeArrowheads="1"/>
+                    </pic:cNvPicPr>
+                  </pic:nvPicPr>
+                  <pic:blipFill>
+                    <a:blip r:embed="rId13"/>
+                    <a:stretch>
+                      <a:fillRect/>
+                    </a:stretch>
+                  </pic:blipFill>
+                  <pic:spPr bwMode="auto">
+                    <a:xfrm>
+                      <a:off x="0" y="0"/>
+                      <a:ext cx="5940425" cy="3660775"/>
+                    </a:xfrm>
+                    <a:prstGeom prst="rect">
+                      <a:avLst/>
+                    </a:prstGeom>
+                  </pic:spPr>
+                </pic:pic>
+              </a:graphicData>
+            </a:graphic>
+          </wp:inline>
+        </w:drawing>
+      </w:r>
+    </w:p>
+    <w:p>
+      <w:pPr>
+        <w:pStyle w:val="Normal"/>
+        <w:spacing w:lineRule="auto" w:line="360"/>
+        <w:jc w:val="center"/>
+        <w:rPr>
+          <w:sz w:val="28"/>
+          <w:szCs w:val="28"/>
+        </w:rPr>
+      </w:pPr>
+      <w:r>
+        <w:rPr>
+          <w:sz w:val="28"/>
+          <w:szCs w:val="28"/>
+        </w:rPr>
+        <w:t>ARP</w:t>
+      </w:r>
+    </w:p>
+    <w:p>
+      <w:pPr>
+        <w:pStyle w:val="Normal"/>
+        <w:spacing w:lineRule="auto" w:line="360"/>
+        <w:jc w:val="center"/>
+        <w:rPr>
+          <w:sz w:val="28"/>
+          <w:szCs w:val="28"/>
+        </w:rPr>
+      </w:pPr>
+      <w:r>
+        <w:rPr>
+          <w:sz w:val="28"/>
+          <w:szCs w:val="28"/>
+        </w:rPr>
+        <w:drawing>
+          <wp:inline distT="0" distB="0" distL="0" distR="0">
+            <wp:extent cx="5940425" cy="904240"/>
+            <wp:effectExtent l="0" t="0" r="0" b="0"/>
+            <wp:docPr id="13" name="Image13" descr=""/>
+            <wp:cNvGraphicFramePr>
+              <a:graphicFrameLocks xmlns:a="http://schemas.openxmlformats.org/drawingml/2006/main" noChangeAspect="1"/>
+            </wp:cNvGraphicFramePr>
+            <a:graphic xmlns:a="http://schemas.openxmlformats.org/drawingml/2006/main">
+              <a:graphicData uri="http://schemas.openxmlformats.org/drawingml/2006/picture">
+                <pic:pic xmlns:pic="http://schemas.openxmlformats.org/drawingml/2006/picture">
+                  <pic:nvPicPr>
+                    <pic:cNvPr id="13" name="Image13" descr=""/>
+                    <pic:cNvPicPr>
+                      <a:picLocks noChangeAspect="1" noChangeArrowheads="1"/>
+                    </pic:cNvPicPr>
+                  </pic:nvPicPr>
+                  <pic:blipFill>
+                    <a:blip r:embed="rId14"/>
+                    <a:stretch>
+                      <a:fillRect/>
+                    </a:stretch>
+                  </pic:blipFill>
+                  <pic:spPr bwMode="auto">
+                    <a:xfrm>
+                      <a:off x="0" y="0"/>
+                      <a:ext cx="5940425" cy="904240"/>
+                    </a:xfrm>
+                    <a:prstGeom prst="rect">
+                      <a:avLst/>
+                    </a:prstGeom>
+                  </pic:spPr>
+                </pic:pic>
+              </a:graphicData>
+            </a:graphic>
+          </wp:inline>
+        </w:drawing>
+      </w:r>
+    </w:p>
+    <w:p>
+      <w:pPr>
+        <w:pStyle w:val="Normal"/>
+        <w:spacing w:lineRule="auto" w:line="360"/>
+        <w:jc w:val="center"/>
+        <w:rPr>
+          <w:sz w:val="28"/>
+          <w:szCs w:val="28"/>
+        </w:rPr>
+      </w:pPr>
+      <w:r>
+        <w:rPr>
+          <w:sz w:val="28"/>
+          <w:szCs w:val="28"/>
+        </w:rPr>
+        <w:drawing>
+          <wp:inline distT="0" distB="0" distL="0" distR="0">
+            <wp:extent cx="5924550" cy="1152525"/>
+            <wp:effectExtent l="0" t="0" r="0" b="0"/>
+            <wp:docPr id="14" name="Image14" descr=""/>
+            <wp:cNvGraphicFramePr>
+              <a:graphicFrameLocks xmlns:a="http://schemas.openxmlformats.org/drawingml/2006/main" noChangeAspect="1"/>
+            </wp:cNvGraphicFramePr>
+            <a:graphic xmlns:a="http://schemas.openxmlformats.org/drawingml/2006/main">
+              <a:graphicData uri="http://schemas.openxmlformats.org/drawingml/2006/picture">
+                <pic:pic xmlns:pic="http://schemas.openxmlformats.org/drawingml/2006/picture">
+                  <pic:nvPicPr>
+                    <pic:cNvPr id="14" name="Image14" descr=""/>
+                    <pic:cNvPicPr>
+                      <a:picLocks noChangeAspect="1" noChangeArrowheads="1"/>
+                    </pic:cNvPicPr>
+                  </pic:nvPicPr>
+                  <pic:blipFill>
+                    <a:blip r:embed="rId15"/>
+                    <a:stretch>
+                      <a:fillRect/>
+                    </a:stretch>
+                  </pic:blipFill>
+                  <pic:spPr bwMode="auto">
+                    <a:xfrm>
+                      <a:off x="0" y="0"/>
+                      <a:ext cx="5924550" cy="1152525"/>
+                    </a:xfrm>
+                    <a:prstGeom prst="rect">
+                      <a:avLst/>
+                    </a:prstGeom>
+                  </pic:spPr>
+                </pic:pic>
+              </a:graphicData>
+            </a:graphic>
+          </wp:inline>
+        </w:drawing>
+      </w:r>
+    </w:p>
+    <w:p>
+      <w:pPr>
+        <w:pStyle w:val="Normal"/>
+        <w:spacing w:lineRule="auto" w:line="360"/>
+        <w:jc w:val="center"/>
+        <w:rPr>
+          <w:sz w:val="28"/>
+          <w:szCs w:val="28"/>
+        </w:rPr>
+      </w:pPr>
+      <w:r>
+        <w:rPr>
+          <w:sz w:val="28"/>
+          <w:szCs w:val="28"/>
+        </w:rPr>
+        <w:drawing>
+          <wp:inline distT="0" distB="0" distL="0" distR="0">
+            <wp:extent cx="5940425" cy="3506470"/>
+            <wp:effectExtent l="0" t="0" r="0" b="0"/>
+            <wp:docPr id="15" name="Image15" descr=""/>
+            <wp:cNvGraphicFramePr>
+              <a:graphicFrameLocks xmlns:a="http://schemas.openxmlformats.org/drawingml/2006/main" noChangeAspect="1"/>
+            </wp:cNvGraphicFramePr>
+            <a:graphic xmlns:a="http://schemas.openxmlformats.org/drawingml/2006/main">
+              <a:graphicData uri="http://schemas.openxmlformats.org/drawingml/2006/picture">
+                <pic:pic xmlns:pic="http://schemas.openxmlformats.org/drawingml/2006/picture">
+                  <pic:nvPicPr>
+                    <pic:cNvPr id="15" name="Image15" descr=""/>
+                    <pic:cNvPicPr>
+                      <a:picLocks noChangeAspect="1" noChangeArrowheads="1"/>
+                    </pic:cNvPicPr>
+                  </pic:nvPicPr>
+                  <pic:blipFill>
+                    <a:blip r:embed="rId16"/>
+                    <a:stretch>
+                      <a:fillRect/>
+                    </a:stretch>
+                  </pic:blipFill>
+                  <pic:spPr bwMode="auto">
+                    <a:xfrm>
+                      <a:off x="0" y="0"/>
+                      <a:ext cx="5940425" cy="3506470"/>
+                    </a:xfrm>
+                    <a:prstGeom prst="rect">
+                      <a:avLst/>
+                    </a:prstGeom>
+                  </pic:spPr>
+                </pic:pic>
+              </a:graphicData>
+            </a:graphic>
+          </wp:inline>
+        </w:drawing>
+      </w:r>
+    </w:p>
+    <w:p>
+      <w:pPr>
+        <w:pStyle w:val="Normal"/>
+        <w:spacing w:lineRule="auto" w:line="360"/>
+        <w:jc w:val="center"/>
+        <w:rPr>
+          <w:sz w:val="28"/>
+          <w:szCs w:val="28"/>
+        </w:rPr>
+      </w:pPr>
+      <w:r>
+        <w:rPr>
+          <w:sz w:val="28"/>
+          <w:szCs w:val="28"/>
+        </w:rPr>
+        <w:drawing>
+          <wp:inline distT="0" distB="0" distL="0" distR="0">
+            <wp:extent cx="5940425" cy="2119630"/>
+            <wp:effectExtent l="0" t="0" r="0" b="0"/>
+            <wp:docPr id="16" name="Image16" descr=""/>
+            <wp:cNvGraphicFramePr>
+              <a:graphicFrameLocks xmlns:a="http://schemas.openxmlformats.org/drawingml/2006/main" noChangeAspect="1"/>
+            </wp:cNvGraphicFramePr>
+            <a:graphic xmlns:a="http://schemas.openxmlformats.org/drawingml/2006/main">
+              <a:graphicData uri="http://schemas.openxmlformats.org/drawingml/2006/picture">
+                <pic:pic xmlns:pic="http://schemas.openxmlformats.org/drawingml/2006/picture">
+                  <pic:nvPicPr>
+                    <pic:cNvPr id="16" name="Image16" descr=""/>
+                    <pic:cNvPicPr>
+                      <a:picLocks noChangeAspect="1" noChangeArrowheads="1"/>
+                    </pic:cNvPicPr>
+                  </pic:nvPicPr>
+                  <pic:blipFill>
+                    <a:blip r:embed="rId17"/>
+                    <a:stretch>
+                      <a:fillRect/>
+                    </a:stretch>
+                  </pic:blipFill>
+                  <pic:spPr bwMode="auto">
+                    <a:xfrm>
+                      <a:off x="0" y="0"/>
+                      <a:ext cx="5940425" cy="2119630"/>
+                    </a:xfrm>
+                    <a:prstGeom prst="rect">
+                      <a:avLst/>
+                    </a:prstGeom>
+                  </pic:spPr>
+                </pic:pic>
+              </a:graphicData>
+            </a:graphic>
+          </wp:inline>
+        </w:drawing>
+      </w:r>
+    </w:p>
+    <w:p>
+      <w:pPr>
+        <w:pStyle w:val="Normal"/>
+        <w:spacing w:lineRule="auto" w:line="360"/>
+        <w:jc w:val="center"/>
+        <w:rPr>
+          <w:sz w:val="28"/>
+          <w:szCs w:val="28"/>
+        </w:rPr>
+      </w:pPr>
+      <w:r>
+        <w:rPr/>
+      </w:r>
+    </w:p>
+    <w:p>
+      <w:pPr>
+        <w:pStyle w:val="Normal"/>
+        <w:spacing w:lineRule="auto" w:line="360"/>
+        <w:jc w:val="center"/>
+        <w:rPr>
+          <w:sz w:val="28"/>
+          <w:szCs w:val="28"/>
+        </w:rPr>
+      </w:pPr>
+      <w:r>
+        <w:rPr/>
+      </w:r>
+    </w:p>
+    <w:p>
+      <w:pPr>
+        <w:pStyle w:val="Normal"/>
+        <w:spacing w:lineRule="auto" w:line="360"/>
+        <w:jc w:val="center"/>
+        <w:rPr>
+          <w:sz w:val="28"/>
+          <w:szCs w:val="28"/>
+        </w:rPr>
+      </w:pPr>
+      <w:r>
+        <w:rPr>
+          <w:sz w:val="28"/>
+          <w:szCs w:val="28"/>
+        </w:rPr>
+        <w:drawing>
+          <wp:inline distT="0" distB="0" distL="0" distR="0">
+            <wp:extent cx="5940425" cy="3938905"/>
+            <wp:effectExtent l="0" t="0" r="0" b="0"/>
+            <wp:docPr id="17" name="Image17" descr=""/>
+            <wp:cNvGraphicFramePr>
+              <a:graphicFrameLocks xmlns:a="http://schemas.openxmlformats.org/drawingml/2006/main" noChangeAspect="1"/>
+            </wp:cNvGraphicFramePr>
+            <a:graphic xmlns:a="http://schemas.openxmlformats.org/drawingml/2006/main">
+              <a:graphicData uri="http://schemas.openxmlformats.org/drawingml/2006/picture">
+                <pic:pic xmlns:pic="http://schemas.openxmlformats.org/drawingml/2006/picture">
+                  <pic:nvPicPr>
+                    <pic:cNvPr id="17" name="Image17" descr=""/>
+                    <pic:cNvPicPr>
+                      <a:picLocks noChangeAspect="1" noChangeArrowheads="1"/>
+                    </pic:cNvPicPr>
+                  </pic:nvPicPr>
+                  <pic:blipFill>
+                    <a:blip r:embed="rId18"/>
+                    <a:stretch>
+                      <a:fillRect/>
+                    </a:stretch>
+                  </pic:blipFill>
+                  <pic:spPr bwMode="auto">
+                    <a:xfrm>
+                      <a:off x="0" y="0"/>
+                      <a:ext cx="5940425" cy="3938905"/>
+                    </a:xfrm>
+                    <a:prstGeom prst="rect">
+                      <a:avLst/>
+                    </a:prstGeom>
+                  </pic:spPr>
+                </pic:pic>
+              </a:graphicData>
+            </a:graphic>
+          </wp:inline>
+        </w:drawing>
+      </w:r>
+    </w:p>
+    <w:p>
+      <w:pPr>
+        <w:pStyle w:val="Normal"/>
+        <w:spacing w:lineRule="auto" w:line="360"/>
+        <w:jc w:val="center"/>
+        <w:rPr>
+          <w:sz w:val="28"/>
+          <w:szCs w:val="28"/>
+        </w:rPr>
+      </w:pPr>
+      <w:r>
+        <w:rPr>
+          <w:sz w:val="28"/>
+          <w:szCs w:val="28"/>
+        </w:rPr>
+        <w:t>Подробное описание ip пакета</w:t>
+      </w:r>
+    </w:p>
+    <w:p>
+      <w:pPr>
+        <w:pStyle w:val="Normal"/>
+        <w:spacing w:lineRule="auto" w:line="360"/>
+        <w:jc w:val="center"/>
+        <w:rPr>
+          <w:sz w:val="28"/>
+          <w:szCs w:val="28"/>
+        </w:rPr>
+      </w:pPr>
+      <w:r>
+        <w:rPr>
+          <w:sz w:val="28"/>
+          <w:szCs w:val="28"/>
+        </w:rPr>
+        <w:drawing>
+          <wp:inline distT="0" distB="0" distL="0" distR="0">
+            <wp:extent cx="5940425" cy="4422775"/>
+            <wp:effectExtent l="0" t="0" r="0" b="0"/>
+            <wp:docPr id="18" name="Image18" descr=""/>
+            <wp:cNvGraphicFramePr>
+              <a:graphicFrameLocks xmlns:a="http://schemas.openxmlformats.org/drawingml/2006/main" noChangeAspect="1"/>
+            </wp:cNvGraphicFramePr>
+            <a:graphic xmlns:a="http://schemas.openxmlformats.org/drawingml/2006/main">
+              <a:graphicData uri="http://schemas.openxmlformats.org/drawingml/2006/picture">
+                <pic:pic xmlns:pic="http://schemas.openxmlformats.org/drawingml/2006/picture">
+                  <pic:nvPicPr>
+                    <pic:cNvPr id="18" name="Image18" descr=""/>
+                    <pic:cNvPicPr>
+                      <a:picLocks noChangeAspect="1" noChangeArrowheads="1"/>
+                    </pic:cNvPicPr>
+                  </pic:nvPicPr>
+                  <pic:blipFill>
+                    <a:blip r:embed="rId19"/>
+                    <a:stretch>
+                      <a:fillRect/>
+                    </a:stretch>
+                  </pic:blipFill>
+                  <pic:spPr bwMode="auto">
+                    <a:xfrm>
+                      <a:off x="0" y="0"/>
+                      <a:ext cx="5940425" cy="4422775"/>
+                    </a:xfrm>
+                    <a:prstGeom prst="rect">
+                      <a:avLst/>
+                    </a:prstGeom>
+                  </pic:spPr>
+                </pic:pic>
+              </a:graphicData>
+            </a:graphic>
+          </wp:inline>
+        </w:drawing>
+      </w:r>
+    </w:p>
+    <w:p>
+      <w:pPr>
+        <w:pStyle w:val="Normal"/>
+        <w:spacing w:lineRule="auto" w:line="360"/>
+        <w:jc w:val="center"/>
+        <w:rPr>
+          <w:sz w:val="28"/>
+          <w:szCs w:val="28"/>
+        </w:rPr>
+      </w:pPr>
+      <w:r>
+        <w:rPr>
+          <w:sz w:val="28"/>
+          <w:szCs w:val="28"/>
+        </w:rPr>
+        <w:t>PING отслеживание</w:t>
+      </w:r>
+      <w:r>
+        <w:rPr>
+          <w:sz w:val="28"/>
+          <w:szCs w:val="28"/>
+        </w:rPr>
+        <w:t xml:space="preserve"> </w:t>
+        <w:tab/>
+      </w:r>
+      <w:r>
+        <w:rPr>
+          <w:sz w:val="28"/>
+          <w:szCs w:val="28"/>
+        </w:rPr>
+        <w:drawing>
+          <wp:inline distT="0" distB="0" distL="0" distR="0">
+            <wp:extent cx="5940425" cy="2004695"/>
+            <wp:effectExtent l="0" t="0" r="0" b="0"/>
+            <wp:docPr id="19" name="Image19" descr=""/>
+            <wp:cNvGraphicFramePr>
+              <a:graphicFrameLocks xmlns:a="http://schemas.openxmlformats.org/drawingml/2006/main" noChangeAspect="1"/>
+            </wp:cNvGraphicFramePr>
+            <a:graphic xmlns:a="http://schemas.openxmlformats.org/drawingml/2006/main">
+              <a:graphicData uri="http://schemas.openxmlformats.org/drawingml/2006/picture">
+                <pic:pic xmlns:pic="http://schemas.openxmlformats.org/drawingml/2006/picture">
+                  <pic:nvPicPr>
+                    <pic:cNvPr id="19" name="Image19" descr=""/>
+                    <pic:cNvPicPr>
+                      <a:picLocks noChangeAspect="1" noChangeArrowheads="1"/>
+                    </pic:cNvPicPr>
+                  </pic:nvPicPr>
+                  <pic:blipFill>
+                    <a:blip r:embed="rId20"/>
+                    <a:stretch>
+                      <a:fillRect/>
+                    </a:stretch>
+                  </pic:blipFill>
+                  <pic:spPr bwMode="auto">
+                    <a:xfrm>
+                      <a:off x="0" y="0"/>
+                      <a:ext cx="5940425" cy="2004695"/>
+                    </a:xfrm>
+                    <a:prstGeom prst="rect">
+                      <a:avLst/>
+                    </a:prstGeom>
+                  </pic:spPr>
+                </pic:pic>
+              </a:graphicData>
+            </a:graphic>
+          </wp:inline>
+        </w:drawing>
+      </w:r>
+    </w:p>
+    <w:p>
+      <w:pPr>
+        <w:pStyle w:val="Normal"/>
+        <w:spacing w:lineRule="auto" w:line="360"/>
+        <w:jc w:val="center"/>
+        <w:rPr>
+          <w:sz w:val="28"/>
+          <w:szCs w:val="28"/>
+        </w:rPr>
+      </w:pPr>
+      <w:r>
+        <w:rPr>
+          <w:sz w:val="28"/>
+          <w:szCs w:val="28"/>
+        </w:rPr>
+        <w:drawing>
+          <wp:inline distT="0" distB="0" distL="0" distR="0">
+            <wp:extent cx="5940425" cy="4054475"/>
+            <wp:effectExtent l="0" t="0" r="0" b="0"/>
+            <wp:docPr id="20" name="Image20" descr=""/>
+            <wp:cNvGraphicFramePr>
+              <a:graphicFrameLocks xmlns:a="http://schemas.openxmlformats.org/drawingml/2006/main" noChangeAspect="1"/>
+            </wp:cNvGraphicFramePr>
+            <a:graphic xmlns:a="http://schemas.openxmlformats.org/drawingml/2006/main">
+              <a:graphicData uri="http://schemas.openxmlformats.org/drawingml/2006/picture">
+                <pic:pic xmlns:pic="http://schemas.openxmlformats.org/drawingml/2006/picture">
+                  <pic:nvPicPr>
+                    <pic:cNvPr id="20" name="Image20" descr=""/>
+                    <pic:cNvPicPr>
+                      <a:picLocks noChangeAspect="1" noChangeArrowheads="1"/>
+                    </pic:cNvPicPr>
+                  </pic:nvPicPr>
+                  <pic:blipFill>
+                    <a:blip r:embed="rId21"/>
+                    <a:stretch>
+                      <a:fillRect/>
+                    </a:stretch>
+                  </pic:blipFill>
+                  <pic:spPr bwMode="auto">
+                    <a:xfrm>
+                      <a:off x="0" y="0"/>
+                      <a:ext cx="5940425" cy="4054475"/>
+                    </a:xfrm>
+                    <a:prstGeom prst="rect">
+                      <a:avLst/>
+                    </a:prstGeom>
+                  </pic:spPr>
+                </pic:pic>
+              </a:graphicData>
+            </a:graphic>
+          </wp:inline>
+        </w:drawing>
+      </w:r>
+    </w:p>
+    <w:p>
+      <w:pPr>
+        <w:pStyle w:val="Normal"/>
+        <w:spacing w:lineRule="auto" w:line="360"/>
+        <w:jc w:val="center"/>
+        <w:rPr>
+          <w:sz w:val="28"/>
+          <w:szCs w:val="28"/>
+        </w:rPr>
+      </w:pPr>
+      <w:r>
+        <w:rPr>
+          <w:sz w:val="28"/>
+          <w:szCs w:val="28"/>
+        </w:rPr>
+        <w:t>ВЫВОД К РАБОТЕ:</w:t>
+      </w:r>
+    </w:p>
+    <w:p>
+      <w:pPr>
+        <w:pStyle w:val="Normal"/>
+        <w:spacing w:lineRule="auto" w:line="360"/>
+        <w:ind w:firstLine="709"/>
+        <w:jc w:val="both"/>
+        <w:rPr>
+          <w:sz w:val="28"/>
+        </w:rPr>
+      </w:pPr>
+      <w:r>
+        <w:rPr>
+          <w:sz w:val="28"/>
+        </w:rPr>
+        <w:t xml:space="preserve">Я узнал принципы анализа сетевого трафика. Научился использовать сетевой анализатор (сниффер </w:t>
+      </w:r>
+      <w:r>
+        <w:rPr>
+          <w:sz w:val="28"/>
+          <w:lang w:val="en-US"/>
+        </w:rPr>
         <w:t xml:space="preserve">Wireshark). </w:t>
       </w:r>
       <w:r>
         <w:rPr>
           <w:sz w:val="28"/>
         </w:rPr>
-        <w:t>Научи</w:t>
-      </w:r>
-      <w:r>
-        <w:rPr>
-          <w:sz w:val="28"/>
-        </w:rPr>
-        <w:t>л</w:t>
-      </w:r>
-      <w:r>
-        <w:rPr>
-          <w:sz w:val="28"/>
-        </w:rPr>
-        <w:t xml:space="preserve">ся анализировать сетевой трафик на примере протоколов </w:t>
+        <w:t xml:space="preserve">Научился анализировать сетевой трафик на примере протоколов </w:t>
       </w:r>
       <w:r>
         <w:rPr>
@@ -1394,78 +3035,71 @@
       </w:r>
     </w:p>
     <w:sectPr>
-      <w:footerReference w:type="even" r:id="rId6"/>
-      <w:footerReference w:type="default" r:id="rId7"/>
-      <w:footerReference w:type="first" r:id="rId8"/>
+      <w:footerReference w:type="even" r:id="rId22"/>
+      <w:footerReference w:type="default" r:id="rId23"/>
+      <w:footerReference w:type="first" r:id="rId24"/>
+      <w:type w:val="nextPage"/>
       <w:pgSz w:w="11906" w:h="16838"/>
-      <w:pgMar w:top="1134" w:right="850" w:bottom="1134" w:left="1701" w:header="0" w:footer="708" w:gutter="0"/>
-      <w:cols w:space="720"/>
-      <w:formProt w:val="0"/>
+      <w:pgMar w:left="1701" w:right="850" w:gutter="0" w:header="0" w:top="1134" w:footer="708" w:bottom="1134"/>
+      <w:pgNumType w:fmt="decimal"/>
+      <w:formProt w:val="false"/>
       <w:titlePg/>
-      <w:docGrid w:linePitch="360" w:charSpace="12288"/>
+      <w:textDirection w:val="lrTb"/>
+      <w:docGrid w:type="default" w:linePitch="360" w:charSpace="16384"/>
     </w:sectPr>
   </w:body>
 </w:document>
 </file>
 
-<file path=word/endnotes.xml><?xml version="1.0" encoding="utf-8"?>
-<w:endnotes xmlns:wpc="http://schemas.microsoft.com/office/word/2010/wordprocessingCanvas" xmlns:cx="http://schemas.microsoft.com/office/drawing/2014/chartex" xmlns:cx1="http://schemas.microsoft.com/office/drawing/2015/9/8/chartex" xmlns:cx2="http://schemas.microsoft.com/office/drawing/2015/10/21/chartex" xmlns:cx3="http://schemas.microsoft.com/office/drawing/2016/5/9/chartex" xmlns:cx4="http://schemas.microsoft.com/office/drawing/2016/5/10/chartex" xmlns:cx5="http://schemas.microsoft.com/office/drawing/2016/5/11/chartex" xmlns:cx6="http://schemas.microsoft.com/office/drawing/2016/5/12/chartex" xmlns:cx7="http://schemas.microsoft.com/office/drawing/2016/5/13/chartex" xmlns:cx8="http://schemas.microsoft.com/office/drawing/2016/5/14/chartex" xmlns:mc="http://schemas.openxmlformats.org/markup-compatibility/2006" xmlns:aink="http://schemas.microsoft.com/office/drawing/2016/ink" xmlns:am3d="http://schemas.microsoft.com/office/drawing/2017/model3d" xmlns:o="urn:schemas-microsoft-com:office:office" xmlns:oel="http://schemas.microsoft.com/office/2019/extlst" xmlns:r="http://schemas.openxmlformats.org/officeDocument/2006/relationships" xmlns:m="http://schemas.openxmlformats.org/officeDocument/2006/math" xmlns:v="urn:schemas-microsoft-com:vml" xmlns:wp14="http://schemas.microsoft.com/office/word/2010/wordprocessingDrawing" xmlns:wp="http://schemas.openxmlformats.org/drawingml/2006/wordprocessingDrawing" xmlns:w10="urn:schemas-microsoft-com:office:word" xmlns:w="http://schemas.openxmlformats.org/wordprocessingml/2006/main" xmlns:w14="http://schemas.microsoft.com/office/word/2010/wordml" xmlns:w15="http://schemas.microsoft.com/office/word/2012/wordml" xmlns:w16cex="http://schemas.microsoft.com/office/word/2018/wordml/cex" xmlns:w16cid="http://schemas.microsoft.com/office/word/2016/wordml/cid" xmlns:w16="http://schemas.microsoft.com/office/word/2018/wordml" xmlns:w16sdtdh="http://schemas.microsoft.com/office/word/2020/wordml/sdtdatahash" xmlns:w16se="http://schemas.microsoft.com/office/word/2015/wordml/symex" xmlns:wpg="http://schemas.microsoft.com/office/word/2010/wordprocessingGroup" xmlns:wpi="http://schemas.microsoft.com/office/word/2010/wordprocessingInk" xmlns:wne="http://schemas.microsoft.com/office/word/2006/wordml" xmlns:wps="http://schemas.microsoft.com/office/word/2010/wordprocessingShape" mc:Ignorable="w14 w15 w16se w16cid w16 w16cex w16sdtdh wp14">
-  <w:endnote w:type="separator" w:id="-1">
-    <w:p>
-      <w:r>
-        <w:separator/>
-      </w:r>
-    </w:p>
-  </w:endnote>
-  <w:endnote w:type="continuationSeparator" w:id="0">
-    <w:p>
-      <w:r>
-        <w:continuationSeparator/>
-      </w:r>
-    </w:p>
-  </w:endnote>
-</w:endnotes>
-</file>
-
 <file path=word/footer1.xml><?xml version="1.0" encoding="utf-8"?>
-<w:ftr xmlns:wpc="http://schemas.microsoft.com/office/word/2010/wordprocessingCanvas" xmlns:cx="http://schemas.microsoft.com/office/drawing/2014/chartex" xmlns:cx1="http://schemas.microsoft.com/office/drawing/2015/9/8/chartex" xmlns:cx2="http://schemas.microsoft.com/office/drawing/2015/10/21/chartex" xmlns:cx3="http://schemas.microsoft.com/office/drawing/2016/5/9/chartex" xmlns:cx4="http://schemas.microsoft.com/office/drawing/2016/5/10/chartex" xmlns:cx5="http://schemas.microsoft.com/office/drawing/2016/5/11/chartex" xmlns:cx6="http://schemas.microsoft.com/office/drawing/2016/5/12/chartex" xmlns:cx7="http://schemas.microsoft.com/office/drawing/2016/5/13/chartex" xmlns:cx8="http://schemas.microsoft.com/office/drawing/2016/5/14/chartex" xmlns:mc="http://schemas.openxmlformats.org/markup-compatibility/2006" xmlns:aink="http://schemas.microsoft.com/office/drawing/2016/ink" xmlns:am3d="http://schemas.microsoft.com/office/drawing/2017/model3d" xmlns:o="urn:schemas-microsoft-com:office:office" xmlns:oel="http://schemas.microsoft.com/office/2019/extlst" xmlns:r="http://schemas.openxmlformats.org/officeDocument/2006/relationships" xmlns:m="http://schemas.openxmlformats.org/officeDocument/2006/math" xmlns:v="urn:schemas-microsoft-com:vml" xmlns:wp14="http://schemas.microsoft.com/office/word/2010/wordprocessingDrawing" xmlns:wp="http://schemas.openxmlformats.org/drawingml/2006/wordprocessingDrawing" xmlns:w10="urn:schemas-microsoft-com:office:word" xmlns:w="http://schemas.openxmlformats.org/wordprocessingml/2006/main" xmlns:w14="http://schemas.microsoft.com/office/word/2010/wordml" xmlns:w15="http://schemas.microsoft.com/office/word/2012/wordml" xmlns:w16cex="http://schemas.microsoft.com/office/word/2018/wordml/cex" xmlns:w16cid="http://schemas.microsoft.com/office/word/2016/wordml/cid" xmlns:w16="http://schemas.microsoft.com/office/word/2018/wordml" xmlns:w16sdtdh="http://schemas.microsoft.com/office/word/2020/wordml/sdtdatahash" xmlns:w16se="http://schemas.microsoft.com/office/word/2015/wordml/symex" xmlns:wpg="http://schemas.microsoft.com/office/word/2010/wordprocessingGroup" xmlns:wpi="http://schemas.microsoft.com/office/word/2010/wordprocessingInk" xmlns:wne="http://schemas.microsoft.com/office/word/2006/wordml" xmlns:wps="http://schemas.microsoft.com/office/word/2010/wordprocessingShape" mc:Ignorable="w14 w15 w16se w16cid w16 w16cex w16sdtdh wp14">
+<w:ftr xmlns:o="urn:schemas-microsoft-com:office:office" xmlns:r="http://schemas.openxmlformats.org/officeDocument/2006/relationships" xmlns:v="urn:schemas-microsoft-com:vml" xmlns:w="http://schemas.openxmlformats.org/wordprocessingml/2006/main" xmlns:w10="urn:schemas-microsoft-com:office:word" xmlns:wp="http://schemas.openxmlformats.org/drawingml/2006/wordprocessingDrawing" xmlns:wps="http://schemas.microsoft.com/office/word/2010/wordprocessingShape" xmlns:wpg="http://schemas.microsoft.com/office/word/2010/wordprocessingGroup" xmlns:mc="http://schemas.openxmlformats.org/markup-compatibility/2006" xmlns:wp14="http://schemas.microsoft.com/office/word/2010/wordprocessingDrawing" xmlns:w14="http://schemas.microsoft.com/office/word/2010/wordml" xmlns:w15="http://schemas.microsoft.com/office/word/2012/wordml" mc:Ignorable="w14 wp14 w15">
   <w:p>
     <w:pPr>
-      <w:pStyle w:val="ae"/>
+      <w:pStyle w:val="Footer"/>
+      <w:rPr/>
     </w:pPr>
+    <w:r>
+      <w:rPr/>
+    </w:r>
   </w:p>
 </w:ftr>
 </file>
 
 <file path=word/footer2.xml><?xml version="1.0" encoding="utf-8"?>
-<w:ftr xmlns:wpc="http://schemas.microsoft.com/office/word/2010/wordprocessingCanvas" xmlns:cx="http://schemas.microsoft.com/office/drawing/2014/chartex" xmlns:cx1="http://schemas.microsoft.com/office/drawing/2015/9/8/chartex" xmlns:cx2="http://schemas.microsoft.com/office/drawing/2015/10/21/chartex" xmlns:cx3="http://schemas.microsoft.com/office/drawing/2016/5/9/chartex" xmlns:cx4="http://schemas.microsoft.com/office/drawing/2016/5/10/chartex" xmlns:cx5="http://schemas.microsoft.com/office/drawing/2016/5/11/chartex" xmlns:cx6="http://schemas.microsoft.com/office/drawing/2016/5/12/chartex" xmlns:cx7="http://schemas.microsoft.com/office/drawing/2016/5/13/chartex" xmlns:cx8="http://schemas.microsoft.com/office/drawing/2016/5/14/chartex" xmlns:mc="http://schemas.openxmlformats.org/markup-compatibility/2006" xmlns:aink="http://schemas.microsoft.com/office/drawing/2016/ink" xmlns:am3d="http://schemas.microsoft.com/office/drawing/2017/model3d" xmlns:o="urn:schemas-microsoft-com:office:office" xmlns:oel="http://schemas.microsoft.com/office/2019/extlst" xmlns:r="http://schemas.openxmlformats.org/officeDocument/2006/relationships" xmlns:m="http://schemas.openxmlformats.org/officeDocument/2006/math" xmlns:v="urn:schemas-microsoft-com:vml" xmlns:wp14="http://schemas.microsoft.com/office/word/2010/wordprocessingDrawing" xmlns:wp="http://schemas.openxmlformats.org/drawingml/2006/wordprocessingDrawing" xmlns:w10="urn:schemas-microsoft-com:office:word" xmlns:w="http://schemas.openxmlformats.org/wordprocessingml/2006/main" xmlns:w14="http://schemas.microsoft.com/office/word/2010/wordml" xmlns:w15="http://schemas.microsoft.com/office/word/2012/wordml" xmlns:w16cex="http://schemas.microsoft.com/office/word/2018/wordml/cex" xmlns:w16cid="http://schemas.microsoft.com/office/word/2016/wordml/cid" xmlns:w16="http://schemas.microsoft.com/office/word/2018/wordml" xmlns:w16sdtdh="http://schemas.microsoft.com/office/word/2020/wordml/sdtdatahash" xmlns:w16se="http://schemas.microsoft.com/office/word/2015/wordml/symex" xmlns:wpg="http://schemas.microsoft.com/office/word/2010/wordprocessingGroup" xmlns:wpi="http://schemas.microsoft.com/office/word/2010/wordprocessingInk" xmlns:wne="http://schemas.microsoft.com/office/word/2006/wordml" xmlns:wps="http://schemas.microsoft.com/office/word/2010/wordprocessingShape" mc:Ignorable="w14 w15 w16se w16cid w16 w16cex w16sdtdh wp14">
+<w:ftr xmlns:o="urn:schemas-microsoft-com:office:office" xmlns:r="http://schemas.openxmlformats.org/officeDocument/2006/relationships" xmlns:v="urn:schemas-microsoft-com:vml" xmlns:w="http://schemas.openxmlformats.org/wordprocessingml/2006/main" xmlns:w10="urn:schemas-microsoft-com:office:word" xmlns:wp="http://schemas.openxmlformats.org/drawingml/2006/wordprocessingDrawing" xmlns:wps="http://schemas.microsoft.com/office/word/2010/wordprocessingShape" xmlns:wpg="http://schemas.microsoft.com/office/word/2010/wordprocessingGroup" xmlns:mc="http://schemas.openxmlformats.org/markup-compatibility/2006" xmlns:wp14="http://schemas.microsoft.com/office/word/2010/wordprocessingDrawing" xmlns:w14="http://schemas.microsoft.com/office/word/2010/wordml" xmlns:w15="http://schemas.microsoft.com/office/word/2012/wordml" mc:Ignorable="w14 wp14 w15">
   <w:sdt>
     <w:sdtPr>
-      <w:id w:val="-400750695"/>
       <w:docPartObj>
         <w:docPartGallery w:val="Page Numbers (Bottom of Page)"/>
-        <w:docPartUnique/>
+        <w:docPartUnique w:val="true"/>
       </w:docPartObj>
+      <w:id w:val="-400750695"/>
     </w:sdtPr>
     <w:sdtContent>
       <w:p>
         <w:pPr>
-          <w:pStyle w:val="ae"/>
+          <w:pStyle w:val="Footer"/>
           <w:jc w:val="center"/>
+          <w:rPr/>
         </w:pPr>
         <w:r>
+          <w:rPr/>
           <w:fldChar w:fldCharType="begin"/>
         </w:r>
         <w:r>
+          <w:rPr/>
           <w:instrText xml:space="preserve"> PAGE </w:instrText>
         </w:r>
         <w:r>
+          <w:rPr/>
           <w:fldChar w:fldCharType="separate"/>
         </w:r>
         <w:r>
-          <w:t>5</w:t>
+          <w:rPr/>
+          <w:t>12</w:t>
         </w:r>
         <w:r>
+          <w:rPr/>
           <w:fldChar w:fldCharType="end"/>
         </w:r>
       </w:p>
@@ -1473,47 +3107,36 @@
   </w:sdt>
   <w:p>
     <w:pPr>
-      <w:pStyle w:val="ae"/>
+      <w:pStyle w:val="Footer"/>
+      <w:rPr/>
     </w:pPr>
+    <w:r>
+      <w:rPr/>
+    </w:r>
   </w:p>
 </w:ftr>
 </file>
 
 <file path=word/footer3.xml><?xml version="1.0" encoding="utf-8"?>
-<w:ftr xmlns:wpc="http://schemas.microsoft.com/office/word/2010/wordprocessingCanvas" xmlns:cx="http://schemas.microsoft.com/office/drawing/2014/chartex" xmlns:cx1="http://schemas.microsoft.com/office/drawing/2015/9/8/chartex" xmlns:cx2="http://schemas.microsoft.com/office/drawing/2015/10/21/chartex" xmlns:cx3="http://schemas.microsoft.com/office/drawing/2016/5/9/chartex" xmlns:cx4="http://schemas.microsoft.com/office/drawing/2016/5/10/chartex" xmlns:cx5="http://schemas.microsoft.com/office/drawing/2016/5/11/chartex" xmlns:cx6="http://schemas.microsoft.com/office/drawing/2016/5/12/chartex" xmlns:cx7="http://schemas.microsoft.com/office/drawing/2016/5/13/chartex" xmlns:cx8="http://schemas.microsoft.com/office/drawing/2016/5/14/chartex" xmlns:mc="http://schemas.openxmlformats.org/markup-compatibility/2006" xmlns:aink="http://schemas.microsoft.com/office/drawing/2016/ink" xmlns:am3d="http://schemas.microsoft.com/office/drawing/2017/model3d" xmlns:o="urn:schemas-microsoft-com:office:office" xmlns:oel="http://schemas.microsoft.com/office/2019/extlst" xmlns:r="http://schemas.openxmlformats.org/officeDocument/2006/relationships" xmlns:m="http://schemas.openxmlformats.org/officeDocument/2006/math" xmlns:v="urn:schemas-microsoft-com:vml" xmlns:wp14="http://schemas.microsoft.com/office/word/2010/wordprocessingDrawing" xmlns:wp="http://schemas.openxmlformats.org/drawingml/2006/wordprocessingDrawing" xmlns:w10="urn:schemas-microsoft-com:office:word" xmlns:w="http://schemas.openxmlformats.org/wordprocessingml/2006/main" xmlns:w14="http://schemas.microsoft.com/office/word/2010/wordml" xmlns:w15="http://schemas.microsoft.com/office/word/2012/wordml" xmlns:w16cex="http://schemas.microsoft.com/office/word/2018/wordml/cex" xmlns:w16cid="http://schemas.microsoft.com/office/word/2016/wordml/cid" xmlns:w16="http://schemas.microsoft.com/office/word/2018/wordml" xmlns:w16sdtdh="http://schemas.microsoft.com/office/word/2020/wordml/sdtdatahash" xmlns:w16se="http://schemas.microsoft.com/office/word/2015/wordml/symex" xmlns:wpg="http://schemas.microsoft.com/office/word/2010/wordprocessingGroup" xmlns:wpi="http://schemas.microsoft.com/office/word/2010/wordprocessingInk" xmlns:wne="http://schemas.microsoft.com/office/word/2006/wordml" xmlns:wps="http://schemas.microsoft.com/office/word/2010/wordprocessingShape" mc:Ignorable="w14 w15 w16se w16cid w16 w16cex w16sdtdh wp14">
+<w:ftr xmlns:o="urn:schemas-microsoft-com:office:office" xmlns:r="http://schemas.openxmlformats.org/officeDocument/2006/relationships" xmlns:v="urn:schemas-microsoft-com:vml" xmlns:w="http://schemas.openxmlformats.org/wordprocessingml/2006/main" xmlns:w10="urn:schemas-microsoft-com:office:word" xmlns:wp="http://schemas.openxmlformats.org/drawingml/2006/wordprocessingDrawing" xmlns:wps="http://schemas.microsoft.com/office/word/2010/wordprocessingShape" xmlns:wpg="http://schemas.microsoft.com/office/word/2010/wordprocessingGroup" xmlns:mc="http://schemas.openxmlformats.org/markup-compatibility/2006" xmlns:wp14="http://schemas.microsoft.com/office/word/2010/wordprocessingDrawing" xmlns:w14="http://schemas.microsoft.com/office/word/2010/wordml" xmlns:w15="http://schemas.microsoft.com/office/word/2012/wordml" mc:Ignorable="w14 wp14 w15">
   <w:p>
     <w:pPr>
-      <w:pStyle w:val="ae"/>
+      <w:pStyle w:val="Footer"/>
+      <w:rPr/>
     </w:pPr>
+    <w:r>
+      <w:rPr/>
+    </w:r>
   </w:p>
 </w:ftr>
 </file>
 
-<file path=word/footnotes.xml><?xml version="1.0" encoding="utf-8"?>
-<w:footnotes xmlns:wpc="http://schemas.microsoft.com/office/word/2010/wordprocessingCanvas" xmlns:cx="http://schemas.microsoft.com/office/drawing/2014/chartex" xmlns:cx1="http://schemas.microsoft.com/office/drawing/2015/9/8/chartex" xmlns:cx2="http://schemas.microsoft.com/office/drawing/2015/10/21/chartex" xmlns:cx3="http://schemas.microsoft.com/office/drawing/2016/5/9/chartex" xmlns:cx4="http://schemas.microsoft.com/office/drawing/2016/5/10/chartex" xmlns:cx5="http://schemas.microsoft.com/office/drawing/2016/5/11/chartex" xmlns:cx6="http://schemas.microsoft.com/office/drawing/2016/5/12/chartex" xmlns:cx7="http://schemas.microsoft.com/office/drawing/2016/5/13/chartex" xmlns:cx8="http://schemas.microsoft.com/office/drawing/2016/5/14/chartex" xmlns:mc="http://schemas.openxmlformats.org/markup-compatibility/2006" xmlns:aink="http://schemas.microsoft.com/office/drawing/2016/ink" xmlns:am3d="http://schemas.microsoft.com/office/drawing/2017/model3d" xmlns:o="urn:schemas-microsoft-com:office:office" xmlns:oel="http://schemas.microsoft.com/office/2019/extlst" xmlns:r="http://schemas.openxmlformats.org/officeDocument/2006/relationships" xmlns:m="http://schemas.openxmlformats.org/officeDocument/2006/math" xmlns:v="urn:schemas-microsoft-com:vml" xmlns:wp14="http://schemas.microsoft.com/office/word/2010/wordprocessingDrawing" xmlns:wp="http://schemas.openxmlformats.org/drawingml/2006/wordprocessingDrawing" xmlns:w10="urn:schemas-microsoft-com:office:word" xmlns:w="http://schemas.openxmlformats.org/wordprocessingml/2006/main" xmlns:w14="http://schemas.microsoft.com/office/word/2010/wordml" xmlns:w15="http://schemas.microsoft.com/office/word/2012/wordml" xmlns:w16cex="http://schemas.microsoft.com/office/word/2018/wordml/cex" xmlns:w16cid="http://schemas.microsoft.com/office/word/2016/wordml/cid" xmlns:w16="http://schemas.microsoft.com/office/word/2018/wordml" xmlns:w16sdtdh="http://schemas.microsoft.com/office/word/2020/wordml/sdtdatahash" xmlns:w16se="http://schemas.microsoft.com/office/word/2015/wordml/symex" xmlns:wpg="http://schemas.microsoft.com/office/word/2010/wordprocessingGroup" xmlns:wpi="http://schemas.microsoft.com/office/word/2010/wordprocessingInk" xmlns:wne="http://schemas.microsoft.com/office/word/2006/wordml" xmlns:wps="http://schemas.microsoft.com/office/word/2010/wordprocessingShape" mc:Ignorable="w14 w15 w16se w16cid w16 w16cex w16sdtdh wp14">
-  <w:footnote w:type="separator" w:id="-1">
-    <w:p>
-      <w:r>
-        <w:separator/>
-      </w:r>
-    </w:p>
-  </w:footnote>
-  <w:footnote w:type="continuationSeparator" w:id="0">
-    <w:p>
-      <w:r>
-        <w:continuationSeparator/>
-      </w:r>
-    </w:p>
-  </w:footnote>
-</w:footnotes>
-</file>
-
 <file path=word/styles.xml><?xml version="1.0" encoding="utf-8"?>
-<w:styles xmlns:mc="http://schemas.openxmlformats.org/markup-compatibility/2006" xmlns:r="http://schemas.openxmlformats.org/officeDocument/2006/relationships" xmlns:w="http://schemas.openxmlformats.org/wordprocessingml/2006/main" xmlns:w14="http://schemas.microsoft.com/office/word/2010/wordml" xmlns:w15="http://schemas.microsoft.com/office/word/2012/wordml" xmlns:w16cex="http://schemas.microsoft.com/office/word/2018/wordml/cex" xmlns:w16cid="http://schemas.microsoft.com/office/word/2016/wordml/cid" xmlns:w16="http://schemas.microsoft.com/office/word/2018/wordml" xmlns:w16sdtdh="http://schemas.microsoft.com/office/word/2020/wordml/sdtdatahash" xmlns:w16se="http://schemas.microsoft.com/office/word/2015/wordml/symex" mc:Ignorable="w14 w15 w16se w16cid w16 w16cex w16sdtdh">
+<w:styles xmlns:w="http://schemas.openxmlformats.org/wordprocessingml/2006/main" xmlns:w14="http://schemas.microsoft.com/office/word/2010/wordml" xmlns:mc="http://schemas.openxmlformats.org/markup-compatibility/2006" mc:Ignorable="w14">
   <w:docDefaults>
     <w:rPrDefault>
       <w:rPr>
-        <w:rFonts w:asciiTheme="minorHAnsi" w:eastAsiaTheme="minorHAnsi" w:hAnsiTheme="minorHAnsi" w:cstheme="minorBidi"/>
+        <w:rFonts w:ascii="Calibri" w:hAnsi="Calibri" w:eastAsia="Calibri" w:cs="" w:asciiTheme="minorHAnsi" w:cstheme="minorBidi" w:eastAsiaTheme="minorHAnsi" w:hAnsiTheme="minorHAnsi"/>
         <w:sz w:val="22"/>
         <w:szCs w:val="22"/>
         <w:lang w:val="ru-RU" w:eastAsia="en-US" w:bidi="ar-SA"/>
@@ -1521,21 +3144,21 @@
     </w:rPrDefault>
     <w:pPrDefault>
       <w:pPr>
-        <w:suppressAutoHyphens/>
+        <w:suppressAutoHyphens w:val="true"/>
       </w:pPr>
     </w:pPrDefault>
   </w:docDefaults>
   <w:latentStyles w:defLockedState="0" w:defUIPriority="99" w:defSemiHidden="0" w:defUnhideWhenUsed="0" w:defQFormat="0" w:count="376">
     <w:lsdException w:name="Normal" w:uiPriority="0" w:qFormat="1"/>
     <w:lsdException w:name="heading 1" w:uiPriority="9" w:qFormat="1"/>
-    <w:lsdException w:name="heading 2" w:semiHidden="1" w:uiPriority="9" w:unhideWhenUsed="1" w:qFormat="1"/>
-    <w:lsdException w:name="heading 3" w:semiHidden="1" w:uiPriority="9" w:unhideWhenUsed="1" w:qFormat="1"/>
-    <w:lsdException w:name="heading 4" w:semiHidden="1" w:uiPriority="9" w:unhideWhenUsed="1" w:qFormat="1"/>
-    <w:lsdException w:name="heading 5" w:semiHidden="1" w:uiPriority="9" w:unhideWhenUsed="1" w:qFormat="1"/>
-    <w:lsdException w:name="heading 6" w:semiHidden="1" w:uiPriority="9" w:unhideWhenUsed="1" w:qFormat="1"/>
-    <w:lsdException w:name="heading 7" w:semiHidden="1" w:uiPriority="9" w:unhideWhenUsed="1" w:qFormat="1"/>
-    <w:lsdException w:name="heading 8" w:semiHidden="1" w:uiPriority="9" w:unhideWhenUsed="1" w:qFormat="1"/>
-    <w:lsdException w:name="heading 9" w:semiHidden="1" w:uiPriority="9" w:unhideWhenUsed="1" w:qFormat="1"/>
+    <w:lsdException w:name="heading 2" w:uiPriority="9" w:semiHidden="1" w:unhideWhenUsed="1" w:qFormat="1"/>
+    <w:lsdException w:name="heading 3" w:uiPriority="9" w:semiHidden="1" w:unhideWhenUsed="1" w:qFormat="1"/>
+    <w:lsdException w:name="heading 4" w:uiPriority="9" w:semiHidden="1" w:unhideWhenUsed="1" w:qFormat="1"/>
+    <w:lsdException w:name="heading 5" w:uiPriority="9" w:semiHidden="1" w:unhideWhenUsed="1" w:qFormat="1"/>
+    <w:lsdException w:name="heading 6" w:uiPriority="9" w:semiHidden="1" w:unhideWhenUsed="1" w:qFormat="1"/>
+    <w:lsdException w:name="heading 7" w:uiPriority="9" w:semiHidden="1" w:unhideWhenUsed="1" w:qFormat="1"/>
+    <w:lsdException w:name="heading 8" w:uiPriority="9" w:semiHidden="1" w:unhideWhenUsed="1" w:qFormat="1"/>
+    <w:lsdException w:name="heading 9" w:uiPriority="9" w:semiHidden="1" w:unhideWhenUsed="1" w:qFormat="1"/>
     <w:lsdException w:name="index 1" w:semiHidden="1" w:unhideWhenUsed="1"/>
     <w:lsdException w:name="index 2" w:semiHidden="1" w:unhideWhenUsed="1"/>
     <w:lsdException w:name="index 3" w:semiHidden="1" w:unhideWhenUsed="1"/>
@@ -1545,22 +3168,22 @@
     <w:lsdException w:name="index 7" w:semiHidden="1" w:unhideWhenUsed="1"/>
     <w:lsdException w:name="index 8" w:semiHidden="1" w:unhideWhenUsed="1"/>
     <w:lsdException w:name="index 9" w:semiHidden="1" w:unhideWhenUsed="1"/>
-    <w:lsdException w:name="toc 1" w:semiHidden="1" w:uiPriority="39" w:unhideWhenUsed="1"/>
-    <w:lsdException w:name="toc 2" w:semiHidden="1" w:uiPriority="39" w:unhideWhenUsed="1"/>
-    <w:lsdException w:name="toc 3" w:semiHidden="1" w:uiPriority="39" w:unhideWhenUsed="1"/>
-    <w:lsdException w:name="toc 4" w:semiHidden="1" w:uiPriority="39" w:unhideWhenUsed="1"/>
-    <w:lsdException w:name="toc 5" w:semiHidden="1" w:uiPriority="39" w:unhideWhenUsed="1"/>
-    <w:lsdException w:name="toc 6" w:semiHidden="1" w:uiPriority="39" w:unhideWhenUsed="1"/>
-    <w:lsdException w:name="toc 7" w:semiHidden="1" w:uiPriority="39" w:unhideWhenUsed="1"/>
-    <w:lsdException w:name="toc 8" w:semiHidden="1" w:uiPriority="39" w:unhideWhenUsed="1"/>
-    <w:lsdException w:name="toc 9" w:semiHidden="1" w:uiPriority="39" w:unhideWhenUsed="1"/>
+    <w:lsdException w:name="toc 1" w:uiPriority="39" w:semiHidden="1" w:unhideWhenUsed="1"/>
+    <w:lsdException w:name="toc 2" w:uiPriority="39" w:semiHidden="1" w:unhideWhenUsed="1"/>
+    <w:lsdException w:name="toc 3" w:uiPriority="39" w:semiHidden="1" w:unhideWhenUsed="1"/>
+    <w:lsdException w:name="toc 4" w:uiPriority="39" w:semiHidden="1" w:unhideWhenUsed="1"/>
+    <w:lsdException w:name="toc 5" w:uiPriority="39" w:semiHidden="1" w:unhideWhenUsed="1"/>
+    <w:lsdException w:name="toc 6" w:uiPriority="39" w:semiHidden="1" w:unhideWhenUsed="1"/>
+    <w:lsdException w:name="toc 7" w:uiPriority="39" w:semiHidden="1" w:unhideWhenUsed="1"/>
+    <w:lsdException w:name="toc 8" w:uiPriority="39" w:semiHidden="1" w:unhideWhenUsed="1"/>
+    <w:lsdException w:name="toc 9" w:uiPriority="39" w:semiHidden="1" w:unhideWhenUsed="1"/>
     <w:lsdException w:name="Normal Indent" w:semiHidden="1" w:unhideWhenUsed="1"/>
     <w:lsdException w:name="footnote text" w:semiHidden="1" w:unhideWhenUsed="1"/>
     <w:lsdException w:name="annotation text" w:semiHidden="1" w:unhideWhenUsed="1"/>
     <w:lsdException w:name="header" w:semiHidden="1" w:unhideWhenUsed="1"/>
     <w:lsdException w:name="footer" w:semiHidden="1" w:unhideWhenUsed="1"/>
     <w:lsdException w:name="index heading" w:semiHidden="1" w:unhideWhenUsed="1"/>
-    <w:lsdException w:name="caption" w:semiHidden="1" w:uiPriority="35" w:unhideWhenUsed="1" w:qFormat="1"/>
+    <w:lsdException w:name="caption" w:uiPriority="35" w:semiHidden="1" w:unhideWhenUsed="1" w:qFormat="1"/>
     <w:lsdException w:name="table of figures" w:semiHidden="1" w:unhideWhenUsed="1"/>
     <w:lsdException w:name="envelope address" w:semiHidden="1" w:unhideWhenUsed="1"/>
     <w:lsdException w:name="envelope return" w:semiHidden="1" w:unhideWhenUsed="1"/>
@@ -1591,7 +3214,7 @@
     <w:lsdException w:name="Title" w:uiPriority="10" w:qFormat="1"/>
     <w:lsdException w:name="Closing" w:semiHidden="1" w:unhideWhenUsed="1"/>
     <w:lsdException w:name="Signature" w:semiHidden="1" w:unhideWhenUsed="1"/>
-    <w:lsdException w:name="Default Paragraph Font" w:semiHidden="1" w:uiPriority="1" w:unhideWhenUsed="1"/>
+    <w:lsdException w:name="Default Paragraph Font" w:uiPriority="1" w:semiHidden="1" w:unhideWhenUsed="1"/>
     <w:lsdException w:name="Body Text" w:semiHidden="1" w:unhideWhenUsed="1"/>
     <w:lsdException w:name="Body Text Indent" w:semiHidden="1" w:unhideWhenUsed="1"/>
     <w:lsdException w:name="List Continue" w:semiHidden="1" w:unhideWhenUsed="1"/>
@@ -1616,7 +3239,7 @@
     <w:lsdException w:name="Strong" w:uiPriority="22" w:qFormat="1"/>
     <w:lsdException w:name="Emphasis" w:uiPriority="20" w:qFormat="1"/>
     <w:lsdException w:name="Document Map" w:semiHidden="1" w:unhideWhenUsed="1"/>
-    <w:lsdException w:name="Plain Text" w:semiHidden="1" w:uiPriority="0" w:unhideWhenUsed="1"/>
+    <w:lsdException w:name="Plain Text" w:uiPriority="0" w:semiHidden="1" w:unhideWhenUsed="1"/>
     <w:lsdException w:name="E-mail Signature" w:semiHidden="1" w:unhideWhenUsed="1"/>
     <w:lsdException w:name="HTML Top of Form" w:semiHidden="1" w:unhideWhenUsed="1"/>
     <w:lsdException w:name="HTML Bottom of Form" w:semiHidden="1" w:unhideWhenUsed="1"/>
@@ -1791,8 +3414,8 @@
     <w:lsdException w:name="Subtle Reference" w:uiPriority="31" w:qFormat="1"/>
     <w:lsdException w:name="Intense Reference" w:uiPriority="32" w:qFormat="1"/>
     <w:lsdException w:name="Book Title" w:uiPriority="33" w:qFormat="1"/>
-    <w:lsdException w:name="Bibliography" w:semiHidden="1" w:uiPriority="37" w:unhideWhenUsed="1"/>
-    <w:lsdException w:name="TOC Heading" w:semiHidden="1" w:uiPriority="39" w:unhideWhenUsed="1" w:qFormat="1"/>
+    <w:lsdException w:name="Bibliography" w:uiPriority="37" w:semiHidden="1" w:unhideWhenUsed="1"/>
+    <w:lsdException w:name="TOC Heading" w:uiPriority="39" w:semiHidden="1" w:unhideWhenUsed="1" w:qFormat="1"/>
     <w:lsdException w:name="Plain Table 1" w:uiPriority="41"/>
     <w:lsdException w:name="Plain Table 2" w:uiPriority="42"/>
     <w:lsdException w:name="Plain Table 3" w:uiPriority="43"/>
@@ -1903,173 +3526,162 @@
     <w:lsdException w:name="Unresolved Mention" w:semiHidden="1" w:unhideWhenUsed="1"/>
     <w:lsdException w:name="Smart Link" w:semiHidden="1" w:unhideWhenUsed="1"/>
   </w:latentStyles>
-  <w:style w:type="paragraph" w:default="1" w:styleId="a">
+  <w:style w:type="paragraph" w:styleId="Normal" w:default="1">
     <w:name w:val="Normal"/>
     <w:qFormat/>
-    <w:rsid w:val="00DE0D8E"/>
+    <w:rsid w:val="00de0d8e"/>
     <w:pPr>
-      <w:widowControl w:val="0"/>
+      <w:widowControl w:val="false"/>
+      <w:suppressAutoHyphens w:val="true"/>
+      <w:bidi w:val="0"/>
+      <w:spacing w:before="0" w:after="0"/>
+      <w:jc w:val="left"/>
     </w:pPr>
     <w:rPr>
-      <w:rFonts w:ascii="Times New Roman" w:eastAsia="Times New Roman" w:hAnsi="Times New Roman" w:cs="Times New Roman"/>
+      <w:rFonts w:ascii="Times New Roman" w:hAnsi="Times New Roman" w:eastAsia="Times New Roman" w:cs="Times New Roman"/>
+      <w:color w:val="000000"/>
+      <w:kern w:val="0"/>
+      <w:sz w:val="22"/>
+      <w:szCs w:val="20"/>
+      <w:lang w:val="ru-RU" w:eastAsia="ru-RU" w:bidi="ar-SA"/>
+    </w:rPr>
+  </w:style>
+  <w:style w:type="character" w:styleId="DefaultParagraphFont" w:default="1">
+    <w:name w:val="Default Paragraph Font"/>
+    <w:uiPriority w:val="1"/>
+    <w:semiHidden/>
+    <w:unhideWhenUsed/>
+    <w:qFormat/>
+    <w:rPr/>
+  </w:style>
+  <w:style w:type="character" w:styleId="Style14" w:customStyle="1">
+    <w:name w:val="Текст Знак"/>
+    <w:basedOn w:val="DefaultParagraphFont"/>
+    <w:link w:val="PlainText"/>
+    <w:semiHidden/>
+    <w:qFormat/>
+    <w:rsid w:val="000a29dc"/>
+    <w:rPr>
+      <w:rFonts w:ascii="Courier New" w:hAnsi="Courier New" w:eastAsia="Times New Roman" w:cs="Times New Roman"/>
+      <w:sz w:val="20"/>
+      <w:szCs w:val="24"/>
+      <w:lang w:eastAsia="ru-RU"/>
+    </w:rPr>
+  </w:style>
+  <w:style w:type="character" w:styleId="Style15" w:customStyle="1">
+    <w:name w:val="Абзац списка Знак"/>
+    <w:basedOn w:val="DefaultParagraphFont"/>
+    <w:link w:val="ListParagraph"/>
+    <w:uiPriority w:val="34"/>
+    <w:qFormat/>
+    <w:locked/>
+    <w:rsid w:val="000a29dc"/>
+    <w:rPr>
+      <w:rFonts w:ascii="Times New Roman" w:hAnsi="Times New Roman" w:eastAsia="Times New Roman" w:cs="Times New Roman"/>
       <w:color w:val="000000"/>
       <w:szCs w:val="20"/>
       <w:lang w:eastAsia="ru-RU"/>
     </w:rPr>
   </w:style>
-  <w:style w:type="character" w:default="1" w:styleId="a0">
-    <w:name w:val="Default Paragraph Font"/>
-    <w:uiPriority w:val="1"/>
-    <w:semiHidden/>
-    <w:unhideWhenUsed/>
-  </w:style>
-  <w:style w:type="table" w:default="1" w:styleId="a1">
-    <w:name w:val="Normal Table"/>
-    <w:uiPriority w:val="99"/>
-    <w:semiHidden/>
-    <w:unhideWhenUsed/>
-    <w:tblPr>
-      <w:tblInd w:w="0" w:type="dxa"/>
-      <w:tblCellMar>
-        <w:top w:w="0" w:type="dxa"/>
-        <w:left w:w="108" w:type="dxa"/>
-        <w:bottom w:w="0" w:type="dxa"/>
-        <w:right w:w="108" w:type="dxa"/>
-      </w:tblCellMar>
-    </w:tblPr>
-  </w:style>
-  <w:style w:type="numbering" w:default="1" w:styleId="a2">
-    <w:name w:val="No List"/>
-    <w:uiPriority w:val="99"/>
-    <w:semiHidden/>
-    <w:unhideWhenUsed/>
-  </w:style>
-  <w:style w:type="character" w:customStyle="1" w:styleId="a3">
-    <w:name w:val="Текст Знак"/>
-    <w:basedOn w:val="a0"/>
-    <w:link w:val="a4"/>
-    <w:semiHidden/>
-    <w:qFormat/>
-    <w:rsid w:val="000A29DC"/>
-    <w:rPr>
-      <w:rFonts w:ascii="Courier New" w:eastAsia="Times New Roman" w:hAnsi="Courier New" w:cs="Times New Roman"/>
-      <w:sz w:val="20"/>
-      <w:szCs w:val="24"/>
-      <w:lang w:eastAsia="ru-RU"/>
-    </w:rPr>
-  </w:style>
-  <w:style w:type="character" w:customStyle="1" w:styleId="a5">
-    <w:name w:val="Абзац списка Знак"/>
-    <w:basedOn w:val="a0"/>
-    <w:link w:val="a6"/>
-    <w:uiPriority w:val="34"/>
+  <w:style w:type="character" w:styleId="Style16" w:customStyle="1">
+    <w:name w:val="Код Знак"/>
+    <w:basedOn w:val="Style15"/>
+    <w:link w:val="Style20"/>
     <w:qFormat/>
     <w:locked/>
-    <w:rsid w:val="000A29DC"/>
+    <w:rsid w:val="000a29dc"/>
     <w:rPr>
-      <w:rFonts w:ascii="Times New Roman" w:eastAsia="Times New Roman" w:hAnsi="Times New Roman" w:cs="Times New Roman"/>
-      <w:color w:val="000000"/>
-      <w:szCs w:val="20"/>
-      <w:lang w:eastAsia="ru-RU"/>
-    </w:rPr>
-  </w:style>
-  <w:style w:type="character" w:customStyle="1" w:styleId="a7">
-    <w:name w:val="Код Знак"/>
-    <w:basedOn w:val="a5"/>
-    <w:link w:val="a8"/>
-    <w:qFormat/>
-    <w:locked/>
-    <w:rsid w:val="000A29DC"/>
-    <w:rPr>
-      <w:rFonts w:ascii="Courier New" w:eastAsia="Times New Roman" w:hAnsi="Courier New" w:cs="Courier New"/>
-      <w:color w:val="000000" w:themeColor="text1"/>
+      <w:rFonts w:ascii="Courier New" w:hAnsi="Courier New" w:eastAsia="Times New Roman" w:cs="Courier New"/>
+      <w:color w:themeColor="text1" w:val="000000"/>
       <w:sz w:val="20"/>
       <w:szCs w:val="20"/>
       <w:lang w:val="en-US" w:eastAsia="ru-RU"/>
     </w:rPr>
   </w:style>
-  <w:style w:type="character" w:customStyle="1" w:styleId="a9">
+  <w:style w:type="character" w:styleId="Style17" w:customStyle="1">
     <w:name w:val="База Знак"/>
-    <w:basedOn w:val="a0"/>
-    <w:link w:val="aa"/>
+    <w:basedOn w:val="DefaultParagraphFont"/>
+    <w:link w:val="Style21"/>
     <w:qFormat/>
     <w:locked/>
-    <w:rsid w:val="000A29DC"/>
+    <w:rsid w:val="000a29dc"/>
     <w:rPr>
-      <w:rFonts w:ascii="Times New Roman" w:eastAsia="Times New Roman" w:hAnsi="Times New Roman" w:cs="Times New Roman"/>
+      <w:rFonts w:ascii="Times New Roman" w:hAnsi="Times New Roman" w:eastAsia="Times New Roman" w:cs="Times New Roman"/>
       <w:color w:val="000000"/>
       <w:sz w:val="28"/>
       <w:szCs w:val="20"/>
       <w:lang w:eastAsia="ru-RU"/>
     </w:rPr>
   </w:style>
-  <w:style w:type="character" w:customStyle="1" w:styleId="ab">
+  <w:style w:type="character" w:styleId="Style18" w:customStyle="1">
     <w:name w:val="Верхний колонтитул Знак"/>
-    <w:basedOn w:val="a0"/>
-    <w:link w:val="ac"/>
+    <w:basedOn w:val="DefaultParagraphFont"/>
+    <w:link w:val="Header"/>
     <w:uiPriority w:val="99"/>
     <w:qFormat/>
-    <w:rsid w:val="001B1469"/>
+    <w:rsid w:val="001b1469"/>
     <w:rPr>
-      <w:rFonts w:ascii="Times New Roman" w:eastAsia="Times New Roman" w:hAnsi="Times New Roman" w:cs="Times New Roman"/>
+      <w:rFonts w:ascii="Times New Roman" w:hAnsi="Times New Roman" w:eastAsia="Times New Roman" w:cs="Times New Roman"/>
       <w:color w:val="000000"/>
       <w:szCs w:val="20"/>
       <w:lang w:eastAsia="ru-RU"/>
     </w:rPr>
   </w:style>
-  <w:style w:type="character" w:customStyle="1" w:styleId="ad">
+  <w:style w:type="character" w:styleId="Style19" w:customStyle="1">
     <w:name w:val="Нижний колонтитул Знак"/>
-    <w:basedOn w:val="a0"/>
-    <w:link w:val="ae"/>
+    <w:basedOn w:val="DefaultParagraphFont"/>
+    <w:link w:val="Footer"/>
     <w:uiPriority w:val="99"/>
     <w:qFormat/>
-    <w:rsid w:val="001B1469"/>
+    <w:rsid w:val="001b1469"/>
     <w:rPr>
-      <w:rFonts w:ascii="Times New Roman" w:eastAsia="Times New Roman" w:hAnsi="Times New Roman" w:cs="Times New Roman"/>
+      <w:rFonts w:ascii="Times New Roman" w:hAnsi="Times New Roman" w:eastAsia="Times New Roman" w:cs="Times New Roman"/>
       <w:color w:val="000000"/>
       <w:szCs w:val="20"/>
       <w:lang w:eastAsia="ru-RU"/>
     </w:rPr>
   </w:style>
-  <w:style w:type="character" w:styleId="af">
+  <w:style w:type="character" w:styleId="Hyperlink">
     <w:name w:val="Hyperlink"/>
     <w:rPr>
       <w:color w:val="000080"/>
       <w:u w:val="single"/>
     </w:rPr>
   </w:style>
-  <w:style w:type="paragraph" w:customStyle="1" w:styleId="Heading">
+  <w:style w:type="paragraph" w:styleId="Heading" w:customStyle="1">
     <w:name w:val="Heading"/>
-    <w:basedOn w:val="a"/>
-    <w:next w:val="af0"/>
+    <w:basedOn w:val="Normal"/>
+    <w:next w:val="BodyText"/>
     <w:qFormat/>
     <w:pPr>
-      <w:keepNext/>
+      <w:keepNext w:val="true"/>
       <w:spacing w:before="240" w:after="120"/>
     </w:pPr>
     <w:rPr>
-      <w:rFonts w:ascii="Liberation Sans" w:eastAsia="Noto Sans CJK SC" w:hAnsi="Liberation Sans" w:cs="Noto Sans Devanagari"/>
+      <w:rFonts w:ascii="Liberation Sans" w:hAnsi="Liberation Sans" w:eastAsia="Noto Sans CJK SC" w:cs="Noto Sans Devanagari"/>
       <w:sz w:val="28"/>
       <w:szCs w:val="28"/>
     </w:rPr>
   </w:style>
-  <w:style w:type="paragraph" w:styleId="af0">
+  <w:style w:type="paragraph" w:styleId="BodyText">
     <w:name w:val="Body Text"/>
-    <w:basedOn w:val="a"/>
+    <w:basedOn w:val="Normal"/>
     <w:pPr>
-      <w:spacing w:after="140" w:line="276" w:lineRule="auto"/>
+      <w:spacing w:lineRule="auto" w:line="276" w:before="0" w:after="140"/>
     </w:pPr>
+    <w:rPr/>
   </w:style>
-  <w:style w:type="paragraph" w:styleId="af1">
+  <w:style w:type="paragraph" w:styleId="List">
     <w:name w:val="List"/>
-    <w:basedOn w:val="af0"/>
+    <w:basedOn w:val="BodyText"/>
+    <w:pPr/>
     <w:rPr>
       <w:rFonts w:cs="Noto Sans Devanagari"/>
     </w:rPr>
   </w:style>
-  <w:style w:type="paragraph" w:styleId="af2">
-    <w:name w:val="caption"/>
-    <w:basedOn w:val="a"/>
+  <w:style w:type="paragraph" w:styleId="Caption">
+    <w:name w:val="Caption"/>
+    <w:basedOn w:val="Normal"/>
     <w:qFormat/>
     <w:pPr>
       <w:suppressLineNumbers/>
@@ -2083,9 +3695,9 @@
       <w:szCs w:val="24"/>
     </w:rPr>
   </w:style>
-  <w:style w:type="paragraph" w:customStyle="1" w:styleId="Index">
+  <w:style w:type="paragraph" w:styleId="Index" w:customStyle="1">
     <w:name w:val="Index"/>
-    <w:basedOn w:val="a"/>
+    <w:basedOn w:val="Normal"/>
     <w:qFormat/>
     <w:pPr>
       <w:suppressLineNumbers/>
@@ -2094,14 +3706,14 @@
       <w:rFonts w:cs="Noto Sans Devanagari"/>
     </w:rPr>
   </w:style>
-  <w:style w:type="paragraph" w:styleId="a4">
+  <w:style w:type="paragraph" w:styleId="PlainText">
     <w:name w:val="Plain Text"/>
-    <w:basedOn w:val="a"/>
-    <w:link w:val="a3"/>
+    <w:basedOn w:val="Normal"/>
+    <w:link w:val="Style14"/>
     <w:semiHidden/>
     <w:unhideWhenUsed/>
     <w:qFormat/>
-    <w:rsid w:val="000A29DC"/>
+    <w:rsid w:val="000a29dc"/>
     <w:pPr>
       <w:widowControl/>
     </w:pPr>
@@ -2112,134 +3724,163 @@
       <w:szCs w:val="24"/>
     </w:rPr>
   </w:style>
-  <w:style w:type="paragraph" w:styleId="a6">
+  <w:style w:type="paragraph" w:styleId="ListParagraph">
     <w:name w:val="List Paragraph"/>
-    <w:basedOn w:val="a"/>
-    <w:link w:val="a5"/>
+    <w:basedOn w:val="Normal"/>
+    <w:link w:val="Style15"/>
     <w:uiPriority w:val="34"/>
     <w:qFormat/>
-    <w:rsid w:val="000A29DC"/>
+    <w:rsid w:val="000a29dc"/>
     <w:pPr>
+      <w:spacing w:before="0" w:after="0"/>
       <w:ind w:left="720"/>
       <w:contextualSpacing/>
     </w:pPr>
+    <w:rPr/>
   </w:style>
-  <w:style w:type="paragraph" w:customStyle="1" w:styleId="a8">
+  <w:style w:type="paragraph" w:styleId="Style20" w:customStyle="1">
     <w:name w:val="Код"/>
-    <w:basedOn w:val="a6"/>
-    <w:link w:val="a7"/>
+    <w:basedOn w:val="ListParagraph"/>
+    <w:link w:val="Style16"/>
     <w:qFormat/>
-    <w:rsid w:val="000A29DC"/>
+    <w:rsid w:val="000a29dc"/>
     <w:pPr>
-      <w:spacing w:line="276" w:lineRule="auto"/>
+      <w:spacing w:lineRule="auto" w:line="276"/>
       <w:ind w:left="0"/>
     </w:pPr>
     <w:rPr>
       <w:rFonts w:ascii="Courier New" w:hAnsi="Courier New" w:cs="Courier New"/>
-      <w:color w:val="000000" w:themeColor="text1"/>
+      <w:color w:themeColor="text1" w:val="000000"/>
       <w:sz w:val="20"/>
       <w:lang w:val="en-US"/>
     </w:rPr>
   </w:style>
-  <w:style w:type="paragraph" w:customStyle="1" w:styleId="aa">
+  <w:style w:type="paragraph" w:styleId="Style21" w:customStyle="1">
     <w:name w:val="База"/>
-    <w:basedOn w:val="a"/>
-    <w:link w:val="a9"/>
+    <w:basedOn w:val="Normal"/>
+    <w:link w:val="Style17"/>
     <w:qFormat/>
-    <w:rsid w:val="000A29DC"/>
+    <w:rsid w:val="000a29dc"/>
     <w:pPr>
-      <w:spacing w:line="360" w:lineRule="auto"/>
+      <w:spacing w:lineRule="auto" w:line="360"/>
       <w:ind w:firstLine="709"/>
     </w:pPr>
     <w:rPr>
       <w:sz w:val="28"/>
     </w:rPr>
   </w:style>
-  <w:style w:type="paragraph" w:customStyle="1" w:styleId="HeaderandFooter">
+  <w:style w:type="paragraph" w:styleId="HeaderandFooter" w:customStyle="1">
     <w:name w:val="Header and Footer"/>
-    <w:basedOn w:val="a"/>
+    <w:basedOn w:val="Normal"/>
+    <w:qFormat/>
+    <w:pPr/>
+    <w:rPr/>
+  </w:style>
+  <w:style w:type="paragraph" w:styleId="Header">
+    <w:name w:val="Header"/>
+    <w:basedOn w:val="Normal"/>
+    <w:link w:val="Style18"/>
+    <w:uiPriority w:val="99"/>
+    <w:unhideWhenUsed/>
+    <w:rsid w:val="001b1469"/>
+    <w:pPr>
+      <w:tabs>
+        <w:tab w:val="clear" w:pos="708"/>
+        <w:tab w:val="center" w:pos="4677" w:leader="none"/>
+        <w:tab w:val="right" w:pos="9355" w:leader="none"/>
+      </w:tabs>
+    </w:pPr>
+    <w:rPr/>
+  </w:style>
+  <w:style w:type="paragraph" w:styleId="Footer">
+    <w:name w:val="Footer"/>
+    <w:basedOn w:val="Normal"/>
+    <w:link w:val="Style19"/>
+    <w:uiPriority w:val="99"/>
+    <w:unhideWhenUsed/>
+    <w:rsid w:val="001b1469"/>
+    <w:pPr>
+      <w:tabs>
+        <w:tab w:val="clear" w:pos="708"/>
+        <w:tab w:val="center" w:pos="4677" w:leader="none"/>
+        <w:tab w:val="right" w:pos="9355" w:leader="none"/>
+      </w:tabs>
+    </w:pPr>
+    <w:rPr/>
+  </w:style>
+  <w:style w:type="numbering" w:styleId="NoList" w:default="1">
+    <w:name w:val="No List"/>
+    <w:uiPriority w:val="99"/>
+    <w:semiHidden/>
+    <w:unhideWhenUsed/>
     <w:qFormat/>
   </w:style>
-  <w:style w:type="paragraph" w:styleId="ac">
-    <w:name w:val="header"/>
-    <w:basedOn w:val="a"/>
-    <w:link w:val="ab"/>
+  <w:style w:type="table" w:default="1" w:styleId="a1">
+    <w:name w:val="Normal Table"/>
     <w:uiPriority w:val="99"/>
+    <w:semiHidden/>
     <w:unhideWhenUsed/>
-    <w:rsid w:val="001B1469"/>
-    <w:pPr>
-      <w:tabs>
-        <w:tab w:val="center" w:pos="4677"/>
-        <w:tab w:val="right" w:pos="9355"/>
-      </w:tabs>
-    </w:pPr>
-  </w:style>
-  <w:style w:type="paragraph" w:styleId="ae">
-    <w:name w:val="footer"/>
-    <w:basedOn w:val="a"/>
-    <w:link w:val="ad"/>
-    <w:uiPriority w:val="99"/>
-    <w:unhideWhenUsed/>
-    <w:rsid w:val="001B1469"/>
-    <w:pPr>
-      <w:tabs>
-        <w:tab w:val="center" w:pos="4677"/>
-        <w:tab w:val="right" w:pos="9355"/>
-      </w:tabs>
-    </w:pPr>
+    <w:tblPr>
+      <w:tblCellMar>
+        <w:top w:w="0" w:type="dxa"/>
+        <w:left w:w="108" w:type="dxa"/>
+        <w:bottom w:w="0" w:type="dxa"/>
+        <w:right w:w="108" w:type="dxa"/>
+      </w:tblCellMar>
+    </w:tblPr>
   </w:style>
 </w:styles>
 </file>
 
 <file path=word/theme/theme1.xml><?xml version="1.0" encoding="utf-8"?>
-<a:theme xmlns:a="http://schemas.openxmlformats.org/drawingml/2006/main" name="Тема Office">
+<a:theme xmlns:a="http://schemas.openxmlformats.org/drawingml/2006/main" xmlns:r="http://schemas.openxmlformats.org/officeDocument/2006/relationships" name="Тема Office">
   <a:themeElements>
     <a:clrScheme name="Стандартная">
       <a:dk1>
         <a:srgbClr val="000000"/>
       </a:dk1>
       <a:lt1>
-        <a:srgbClr val="FFFFFF"/>
+        <a:srgbClr val="ffffff"/>
       </a:lt1>
       <a:dk2>
-        <a:srgbClr val="44546A"/>
+        <a:srgbClr val="44546a"/>
       </a:dk2>
       <a:lt2>
-        <a:srgbClr val="E7E6E6"/>
+        <a:srgbClr val="e7e6e6"/>
       </a:lt2>
       <a:accent1>
-        <a:srgbClr val="4472C4"/>
+        <a:srgbClr val="4472c4"/>
       </a:accent1>
       <a:accent2>
-        <a:srgbClr val="ED7D31"/>
+        <a:srgbClr val="ed7d31"/>
       </a:accent2>
       <a:accent3>
-        <a:srgbClr val="A5A5A5"/>
+        <a:srgbClr val="a5a5a5"/>
       </a:accent3>
       <a:accent4>
-        <a:srgbClr val="FFC000"/>
+        <a:srgbClr val="ffc000"/>
       </a:accent4>
       <a:accent5>
-        <a:srgbClr val="5B9BD5"/>
+        <a:srgbClr val="5b9bd5"/>
       </a:accent5>
       <a:accent6>
-        <a:srgbClr val="70AD47"/>
+        <a:srgbClr val="70ad47"/>
       </a:accent6>
       <a:hlink>
-        <a:srgbClr val="0563C1"/>
+        <a:srgbClr val="0563c1"/>
       </a:hlink>
       <a:folHlink>
-        <a:srgbClr val="954F72"/>
+        <a:srgbClr val="954f72"/>
       </a:folHlink>
     </a:clrScheme>
     <a:fontScheme name="Стандартная">
       <a:majorFont>
-        <a:latin typeface="Calibri Light" panose="020F0302020204030204"/>
+        <a:latin typeface="Calibri Light" panose="020F0302020204030204" pitchFamily="0" charset="1"/>
         <a:ea typeface=""/>
         <a:cs typeface=""/>
       </a:majorFont>
       <a:minorFont>
-        <a:latin typeface="Calibri" panose="020F0502020204030204"/>
+        <a:latin typeface="Calibri" panose="020F0502020204030204" pitchFamily="0" charset="1"/>
         <a:ea typeface=""/>
         <a:cs typeface=""/>
       </a:minorFont>
@@ -2271,7 +3912,7 @@
             </a:gs>
           </a:gsLst>
           <a:lin ang="5400000" scaled="0"/>
-          <a:tileRect/>
+          <a:tileRect l="0" t="0" r="0" b="0"/>
         </a:gradFill>
         <a:gradFill>
           <a:gsLst>
@@ -2295,7 +3936,7 @@
             </a:gs>
           </a:gsLst>
           <a:lin ang="5400000" scaled="0"/>
-          <a:tileRect/>
+          <a:tileRect l="0" t="0" r="0" b="0"/>
         </a:gradFill>
       </a:fillStyleLst>
       <a:lnStyleLst>
@@ -2355,12 +3996,10 @@
             </a:gs>
           </a:gsLst>
           <a:lin ang="5400000" scaled="0"/>
-          <a:tileRect/>
+          <a:tileRect l="0" t="0" r="0" b="0"/>
         </a:gradFill>
       </a:bgFillStyleLst>
     </a:fmtScheme>
   </a:themeElements>
-  <a:objectDefaults/>
-  <a:extraClrSchemeLst/>
 </a:theme>
 </file>
</xml_diff>